<commit_message>
Remove items from to-do list
</commit_message>
<xml_diff>
--- a/docs/plan/TO-DO Research Paper ECON 623.docx
+++ b/docs/plan/TO-DO Research Paper ECON 623.docx
@@ -1087,66 +1087,6 @@
         </w:numPr>
       </w:pPr>
       <w:r>
-        <w:t>Go through code</w:t>
-      </w:r>
-    </w:p>
-    <w:p>
-      <w:pPr>
-        <w:pStyle w:val="ListParagraph"/>
-        <w:numPr>
-          <w:ilvl w:val="1"/>
-          <w:numId w:val="4"/>
-        </w:numPr>
-      </w:pPr>
-      <w:r>
-        <w:t>Go through code, take note of what to add to paper (e.g., graph of districts which weren’t clean partitions)</w:t>
-      </w:r>
-    </w:p>
-    <w:p>
-      <w:pPr>
-        <w:pStyle w:val="ListParagraph"/>
-        <w:numPr>
-          <w:ilvl w:val="1"/>
-          <w:numId w:val="4"/>
-        </w:numPr>
-      </w:pPr>
-      <w:r>
-        <w:t>Copy and paste code from each chunk into Chat. Confirm it all is good, accurate, would read well to econ pre-doc application committee, and conforms with how I describe the paper in my CV and cover letter.</w:t>
-      </w:r>
-    </w:p>
-    <w:p>
-      <w:pPr>
-        <w:pStyle w:val="ListParagraph"/>
-        <w:numPr>
-          <w:ilvl w:val="0"/>
-          <w:numId w:val="4"/>
-        </w:numPr>
-      </w:pPr>
-      <w:r>
-        <w:t>Go through writing</w:t>
-      </w:r>
-    </w:p>
-    <w:p>
-      <w:pPr>
-        <w:pStyle w:val="ListParagraph"/>
-        <w:numPr>
-          <w:ilvl w:val="1"/>
-          <w:numId w:val="4"/>
-        </w:numPr>
-      </w:pPr>
-      <w:r>
-        <w:t>Copy and paste writing from each section into Chat. Confirm it all is good, accurate, would read well to econ pre-doc application committee, and conforms with how I describe the paper in my CV and cover letter.</w:t>
-      </w:r>
-    </w:p>
-    <w:p>
-      <w:pPr>
-        <w:pStyle w:val="ListParagraph"/>
-        <w:numPr>
-          <w:ilvl w:val="0"/>
-          <w:numId w:val="4"/>
-        </w:numPr>
-      </w:pPr>
-      <w:r>
         <w:t>Proofread</w:t>
       </w:r>
     </w:p>
@@ -1159,7 +1099,6 @@
         </w:numPr>
       </w:pPr>
       <w:r>
-        <w:lastRenderedPageBreak/>
         <w:t>Read through what’s currently there and proofread, edit sentences</w:t>
       </w:r>
     </w:p>
@@ -1228,6 +1167,7 @@
         </w:numPr>
       </w:pPr>
       <w:r>
+        <w:lastRenderedPageBreak/>
         <w:t>Go through “</w:t>
       </w:r>
       <w:r>
@@ -1384,75 +1324,75 @@
         </w:numPr>
       </w:pPr>
       <w:r>
+        <w:t>Could this district matching introduce errors in, say, the way linguistic distance is measured which correlate with the way consumption growth is measured?</w:t>
+      </w:r>
+    </w:p>
+    <w:p>
+      <w:pPr>
+        <w:pStyle w:val="ListParagraph"/>
+        <w:numPr>
+          <w:ilvl w:val="1"/>
+          <w:numId w:val="4"/>
+        </w:numPr>
+      </w:pPr>
+      <w:r>
+        <w:t>Make sure all measured districts are included in the regression and that no many-to-many relationships exist</w:t>
+      </w:r>
+    </w:p>
+    <w:p>
+      <w:pPr>
+        <w:pStyle w:val="ListParagraph"/>
+        <w:numPr>
+          <w:ilvl w:val="0"/>
+          <w:numId w:val="4"/>
+        </w:numPr>
+      </w:pPr>
+      <w:r>
+        <w:t xml:space="preserve">I just found a dataset with district-level enrollment by medium of instruction. Could this be used to make a better framework somehow? </w:t>
+      </w:r>
+    </w:p>
+    <w:p>
+      <w:pPr>
+        <w:pStyle w:val="ListParagraph"/>
+        <w:numPr>
+          <w:ilvl w:val="0"/>
+          <w:numId w:val="4"/>
+        </w:numPr>
+      </w:pPr>
+      <w:r>
+        <w:t>Fix multicollinearity (if it even remains an issue)</w:t>
+      </w:r>
+    </w:p>
+    <w:p>
+      <w:pPr>
+        <w:pStyle w:val="ListParagraph"/>
+        <w:numPr>
+          <w:ilvl w:val="1"/>
+          <w:numId w:val="4"/>
+        </w:numPr>
+      </w:pPr>
+      <w:r>
+        <w:t>First, check if multicollinearity still exists (</w:t>
+      </w:r>
+      <w:proofErr w:type="gramStart"/>
+      <w:r>
+        <w:t>really high</w:t>
+      </w:r>
+      <w:proofErr w:type="gramEnd"/>
+      <w:r>
+        <w:t xml:space="preserve"> joint multicollinearity, high kappa overall; but relatively low kappa for all individual variables) </w:t>
+      </w:r>
+    </w:p>
+    <w:p>
+      <w:pPr>
+        <w:pStyle w:val="ListParagraph"/>
+        <w:numPr>
+          <w:ilvl w:val="2"/>
+          <w:numId w:val="4"/>
+        </w:numPr>
+      </w:pPr>
+      <w:r>
         <w:lastRenderedPageBreak/>
-        <w:t>Could this district matching introduce errors in, say, the way linguistic distance is measured which correlate with the way consumption growth is measured?</w:t>
-      </w:r>
-    </w:p>
-    <w:p>
-      <w:pPr>
-        <w:pStyle w:val="ListParagraph"/>
-        <w:numPr>
-          <w:ilvl w:val="1"/>
-          <w:numId w:val="4"/>
-        </w:numPr>
-      </w:pPr>
-      <w:r>
-        <w:t>Make sure all measured districts are included in the regression and that no many-to-many relationships exist</w:t>
-      </w:r>
-    </w:p>
-    <w:p>
-      <w:pPr>
-        <w:pStyle w:val="ListParagraph"/>
-        <w:numPr>
-          <w:ilvl w:val="0"/>
-          <w:numId w:val="4"/>
-        </w:numPr>
-      </w:pPr>
-      <w:r>
-        <w:t xml:space="preserve">I just found a dataset with district-level enrollment by medium of instruction. Could this be used to make a better framework somehow? </w:t>
-      </w:r>
-    </w:p>
-    <w:p>
-      <w:pPr>
-        <w:pStyle w:val="ListParagraph"/>
-        <w:numPr>
-          <w:ilvl w:val="0"/>
-          <w:numId w:val="4"/>
-        </w:numPr>
-      </w:pPr>
-      <w:r>
-        <w:t>Fix multicollinearity (if it even remains an issue)</w:t>
-      </w:r>
-    </w:p>
-    <w:p>
-      <w:pPr>
-        <w:pStyle w:val="ListParagraph"/>
-        <w:numPr>
-          <w:ilvl w:val="1"/>
-          <w:numId w:val="4"/>
-        </w:numPr>
-      </w:pPr>
-      <w:r>
-        <w:t>First, check if multicollinearity still exists (</w:t>
-      </w:r>
-      <w:proofErr w:type="gramStart"/>
-      <w:r>
-        <w:t>really high</w:t>
-      </w:r>
-      <w:proofErr w:type="gramEnd"/>
-      <w:r>
-        <w:t xml:space="preserve"> joint multicollinearity, high kappa overall; but relatively low kappa for all individual variables) </w:t>
-      </w:r>
-    </w:p>
-    <w:p>
-      <w:pPr>
-        <w:pStyle w:val="ListParagraph"/>
-        <w:numPr>
-          <w:ilvl w:val="2"/>
-          <w:numId w:val="4"/>
-        </w:numPr>
-      </w:pPr>
-      <w:r>
         <w:t xml:space="preserve">If it is </w:t>
       </w:r>
       <w:proofErr w:type="spellStart"/>
@@ -1665,61 +1605,61 @@
         </w:numPr>
       </w:pPr>
       <w:r>
+        <w:t>To do LATE interpretation, would need to show that increasing distance from Hindi doesn’t increase EMIE in some districts while decreasing it for others (i.e., want to make sure linguistic distance has monotonic effect on EMIE)</w:t>
+      </w:r>
+    </w:p>
+    <w:p>
+      <w:pPr>
+        <w:pStyle w:val="ListParagraph"/>
+        <w:numPr>
+          <w:ilvl w:val="2"/>
+          <w:numId w:val="4"/>
+        </w:numPr>
+      </w:pPr>
+      <w:r>
+        <w:t>See @</w:t>
+      </w:r>
+      <w:r>
+        <w:t>klineHeckitsLATENumerical2019</w:t>
+      </w:r>
+      <w:r>
+        <w:t xml:space="preserve"> for (possibly) more</w:t>
+      </w:r>
+    </w:p>
+    <w:p>
+      <w:pPr>
+        <w:pStyle w:val="ListParagraph"/>
+        <w:numPr>
+          <w:ilvl w:val="0"/>
+          <w:numId w:val="4"/>
+        </w:numPr>
+      </w:pPr>
+      <w:r>
+        <w:t>Selection: Change the Heckman implementation and approach</w:t>
+      </w:r>
+    </w:p>
+    <w:p>
+      <w:pPr>
+        <w:pStyle w:val="ListParagraph"/>
+        <w:numPr>
+          <w:ilvl w:val="1"/>
+          <w:numId w:val="4"/>
+        </w:numPr>
+      </w:pPr>
+      <w:r>
+        <w:t>Study existence of aggregation bias: Is the mean IMR a sufficient statistic for selection correlations in my main 2SLS framework? Perhaps, but only with large enough samples for each district</w:t>
+      </w:r>
+    </w:p>
+    <w:p>
+      <w:pPr>
+        <w:pStyle w:val="ListParagraph"/>
+        <w:numPr>
+          <w:ilvl w:val="1"/>
+          <w:numId w:val="4"/>
+        </w:numPr>
+      </w:pPr>
+      <w:r>
         <w:lastRenderedPageBreak/>
-        <w:t>To do LATE interpretation, would need to show that increasing distance from Hindi doesn’t increase EMIE in some districts while decreasing it for others (i.e., want to make sure linguistic distance has monotonic effect on EMIE)</w:t>
-      </w:r>
-    </w:p>
-    <w:p>
-      <w:pPr>
-        <w:pStyle w:val="ListParagraph"/>
-        <w:numPr>
-          <w:ilvl w:val="2"/>
-          <w:numId w:val="4"/>
-        </w:numPr>
-      </w:pPr>
-      <w:r>
-        <w:t>See @</w:t>
-      </w:r>
-      <w:r>
-        <w:t>klineHeckitsLATENumerical2019</w:t>
-      </w:r>
-      <w:r>
-        <w:t xml:space="preserve"> for (possibly) more</w:t>
-      </w:r>
-    </w:p>
-    <w:p>
-      <w:pPr>
-        <w:pStyle w:val="ListParagraph"/>
-        <w:numPr>
-          <w:ilvl w:val="0"/>
-          <w:numId w:val="4"/>
-        </w:numPr>
-      </w:pPr>
-      <w:r>
-        <w:t>Selection: Change the Heckman implementation and approach</w:t>
-      </w:r>
-    </w:p>
-    <w:p>
-      <w:pPr>
-        <w:pStyle w:val="ListParagraph"/>
-        <w:numPr>
-          <w:ilvl w:val="1"/>
-          <w:numId w:val="4"/>
-        </w:numPr>
-      </w:pPr>
-      <w:r>
-        <w:t>Study existence of aggregation bias: Is the mean IMR a sufficient statistic for selection correlations in my main 2SLS framework? Perhaps, but only with large enough samples for each district</w:t>
-      </w:r>
-    </w:p>
-    <w:p>
-      <w:pPr>
-        <w:pStyle w:val="ListParagraph"/>
-        <w:numPr>
-          <w:ilvl w:val="1"/>
-          <w:numId w:val="4"/>
-        </w:numPr>
-      </w:pPr>
-      <w:r>
         <w:t>Standard errors: How do I get accurate standard errors which account for the extra noise added in via aggregation? Bootstrap?</w:t>
       </w:r>
     </w:p>
@@ -1862,7 +1802,6 @@
         </w:numPr>
       </w:pPr>
       <w:r>
-        <w:lastRenderedPageBreak/>
         <w:t xml:space="preserve">Issue: Variable should reflect what the child </w:t>
       </w:r>
       <w:r>
@@ -1937,6 +1876,7 @@
         </w:numPr>
       </w:pPr>
       <w:r>
+        <w:lastRenderedPageBreak/>
         <w:t>Estimate $\</w:t>
       </w:r>
       <w:proofErr w:type="spellStart"/>
@@ -2220,43 +2160,624 @@
         </w:numPr>
       </w:pPr>
       <w:r>
+        <w:t xml:space="preserve">My first thought, to find a close enrolled child match for each unenrolled child and give them the values of the enrolled child, is effectively </w:t>
+      </w:r>
+      <w:proofErr w:type="gramStart"/>
+      <w:r>
+        <w:t>single-imputation</w:t>
+      </w:r>
+      <w:proofErr w:type="gramEnd"/>
+      <w:r>
+        <w:t xml:space="preserve"> by predictive mean matching, which may understate the uncertainty of imputation</w:t>
+      </w:r>
+    </w:p>
+    <w:p>
+      <w:pPr>
+        <w:pStyle w:val="ListParagraph"/>
+        <w:numPr>
+          <w:ilvl w:val="0"/>
+          <w:numId w:val="4"/>
+        </w:numPr>
+      </w:pPr>
+      <w:r>
+        <w:t>Narrative</w:t>
+      </w:r>
+      <w:r>
+        <w:t>/writing</w:t>
+      </w:r>
+    </w:p>
+    <w:p>
+      <w:pPr>
+        <w:pStyle w:val="ListParagraph"/>
+        <w:numPr>
+          <w:ilvl w:val="1"/>
+          <w:numId w:val="4"/>
+        </w:numPr>
+      </w:pPr>
+      <w:r>
+        <w:t>Tighter introduction</w:t>
+      </w:r>
+    </w:p>
+    <w:p>
+      <w:pPr>
+        <w:pStyle w:val="ListParagraph"/>
+        <w:numPr>
+          <w:ilvl w:val="2"/>
+          <w:numId w:val="4"/>
+        </w:numPr>
+      </w:pPr>
+      <w:r>
+        <w:t>Maybe separate introduction and literature review? Have introduction be just like a more thorough abstract</w:t>
+      </w:r>
+    </w:p>
+    <w:p>
+      <w:pPr>
+        <w:pStyle w:val="ListParagraph"/>
+        <w:numPr>
+          <w:ilvl w:val="1"/>
+          <w:numId w:val="4"/>
+        </w:numPr>
+      </w:pPr>
+      <w:r>
+        <w:t>Make abstract pop</w:t>
+      </w:r>
+    </w:p>
+    <w:p>
+      <w:pPr>
+        <w:pStyle w:val="ListParagraph"/>
+        <w:numPr>
+          <w:ilvl w:val="2"/>
+          <w:numId w:val="4"/>
+        </w:numPr>
+      </w:pPr>
+      <w:r>
+        <w:t>Highlight empirical methods, findings</w:t>
+      </w:r>
+    </w:p>
+    <w:p>
+      <w:pPr>
+        <w:pStyle w:val="ListParagraph"/>
+        <w:numPr>
+          <w:ilvl w:val="0"/>
+          <w:numId w:val="4"/>
+        </w:numPr>
+      </w:pPr>
+      <w:r>
+        <w:t>Make better maps for probit</w:t>
+      </w:r>
+    </w:p>
+    <w:p>
+      <w:pPr>
+        <w:pStyle w:val="ListParagraph"/>
+        <w:numPr>
+          <w:ilvl w:val="1"/>
+          <w:numId w:val="4"/>
+        </w:numPr>
+      </w:pPr>
+      <w:r>
         <w:lastRenderedPageBreak/>
-        <w:t xml:space="preserve">My first thought, to find a close enrolled child match for each unenrolled child and give them the values of the enrolled child, is effectively </w:t>
+        <w:t>Make a map of predicted enrollment propensity by district (maybe via district FE or predicted probabilities).</w:t>
+      </w:r>
+    </w:p>
+    <w:p>
+      <w:pPr>
+        <w:pStyle w:val="ListParagraph"/>
+        <w:numPr>
+          <w:ilvl w:val="1"/>
+          <w:numId w:val="4"/>
+        </w:numPr>
+      </w:pPr>
+      <w:r>
+        <w:t>Make a map of IMR or missingness structure (helps explain measurement/coverage).</w:t>
+      </w:r>
+    </w:p>
+    <w:p>
+      <w:pPr>
+        <w:pStyle w:val="ListParagraph"/>
+        <w:numPr>
+          <w:ilvl w:val="0"/>
+          <w:numId w:val="4"/>
+        </w:numPr>
+      </w:pPr>
+      <w:r>
+        <w:t>Fix EMI and response variable measures</w:t>
+      </w:r>
+    </w:p>
+    <w:p>
+      <w:pPr>
+        <w:pStyle w:val="ListParagraph"/>
+        <w:numPr>
+          <w:ilvl w:val="1"/>
+          <w:numId w:val="4"/>
+        </w:numPr>
+      </w:pPr>
+      <w:r>
+        <w:t xml:space="preserve">Percent change </w:t>
+      </w:r>
+      <w:r>
+        <w:t>measures</w:t>
+      </w:r>
+      <w:r>
+        <w:t xml:space="preserve"> </w:t>
+      </w:r>
+      <w:r>
+        <w:t>e.g., %</w:t>
+      </w:r>
+      <w:proofErr w:type="spellStart"/>
+      <w:r>
+        <w:t>ΔConsumption</w:t>
+      </w:r>
+      <w:proofErr w:type="spellEnd"/>
+      <w:r>
+        <w:t xml:space="preserve">, </w:t>
+      </w:r>
+      <w:r>
+        <w:t>as dependent variable</w:t>
+      </w:r>
+      <w:r>
+        <w:t>s</w:t>
+      </w:r>
+      <w:r>
+        <w:t xml:space="preserve"> may be flawed</w:t>
+      </w:r>
+      <w:r>
+        <w:t xml:space="preserve">; perhaps replace with better measures? </w:t>
+      </w:r>
+      <w:r>
+        <w:t xml:space="preserve">See </w:t>
+      </w:r>
+      <w:hyperlink r:id="rId18" w:history="1">
+        <w:r>
+          <w:rPr>
+            <w:rStyle w:val="Hyperlink"/>
+          </w:rPr>
+          <w:t>Using percentage change as a dependent variable? - Cross Validated</w:t>
+        </w:r>
+      </w:hyperlink>
+      <w:r>
+        <w:t xml:space="preserve">, which links to </w:t>
+      </w:r>
+      <w:hyperlink r:id="rId19" w:history="1">
+        <w:r>
+          <w:rPr>
+            <w:rStyle w:val="Hyperlink"/>
+          </w:rPr>
+          <w:t>Linear Regression with a Dependent Variable that is a Ratio - Cross Validated</w:t>
+        </w:r>
+      </w:hyperlink>
+      <w:r>
+        <w:t xml:space="preserve">, which links to </w:t>
+      </w:r>
+      <w:hyperlink r:id="rId20" w:history="1">
+        <w:r>
+          <w:rPr>
+            <w:rStyle w:val="Hyperlink"/>
+          </w:rPr>
+          <w:t xml:space="preserve">Ratios in Regression, aka Questions on </w:t>
+        </w:r>
+        <w:proofErr w:type="spellStart"/>
+        <w:r>
+          <w:rPr>
+            <w:rStyle w:val="Hyperlink"/>
+          </w:rPr>
+          <w:t>Kronmal</w:t>
+        </w:r>
+        <w:proofErr w:type="spellEnd"/>
+        <w:r>
+          <w:rPr>
+            <w:rStyle w:val="Hyperlink"/>
+          </w:rPr>
+          <w:t xml:space="preserve"> - Cross Validated</w:t>
+        </w:r>
+      </w:hyperlink>
+      <w:r>
+        <w:t xml:space="preserve"> and, more importantly, </w:t>
+      </w:r>
+      <w:hyperlink r:id="rId21" w:history="1">
+        <w:r>
+          <w:rPr>
+            <w:rStyle w:val="Hyperlink"/>
+          </w:rPr>
+          <w:t>Spurious Correlation and the Fallacy of the Ratio Standard Revisited</w:t>
+        </w:r>
+      </w:hyperlink>
+      <w:r>
+        <w:t xml:space="preserve">. Also see </w:t>
+      </w:r>
+      <w:hyperlink r:id="rId22" w:history="1">
+        <w:r>
+          <w:rPr>
+            <w:rStyle w:val="Hyperlink"/>
+          </w:rPr>
+          <w:t>Prediction of Percent Change in Linear Regression by Correlated Variables</w:t>
+        </w:r>
+      </w:hyperlink>
+    </w:p>
+    <w:p>
+      <w:pPr>
+        <w:pStyle w:val="ListParagraph"/>
+        <w:numPr>
+          <w:ilvl w:val="0"/>
+          <w:numId w:val="4"/>
+        </w:numPr>
+      </w:pPr>
+      <w:r>
+        <w:t>Regressions: Report multiple specifications</w:t>
+      </w:r>
+    </w:p>
+    <w:p>
+      <w:pPr>
+        <w:pStyle w:val="ListParagraph"/>
+        <w:numPr>
+          <w:ilvl w:val="1"/>
+          <w:numId w:val="4"/>
+        </w:numPr>
+      </w:pPr>
+      <w:r>
+        <w:t>Research h</w:t>
+      </w:r>
+      <w:r>
+        <w:t>ow to report multiple regression specifications in the same table</w:t>
+      </w:r>
+      <w:r>
+        <w:t>.</w:t>
+      </w:r>
+    </w:p>
+    <w:p>
+      <w:pPr>
+        <w:pStyle w:val="ListParagraph"/>
+        <w:numPr>
+          <w:ilvl w:val="1"/>
+          <w:numId w:val="4"/>
+        </w:numPr>
+      </w:pPr>
+      <w:r>
+        <w:t>First have no IV and no controls, then no IV and all controls except for the average IMR, then no IV and all controls including the average IMR, then IV and no controls, then IV and all controls except for the average IMR, then IV and all controls including the average IMR? Would six specifications like this fit best vertically or horizontally on a page? How could I make it so that the table neatly flows onto multiple pages as needed?</w:t>
+      </w:r>
+    </w:p>
+    <w:p>
+      <w:pPr>
+        <w:pStyle w:val="ListParagraph"/>
+        <w:numPr>
+          <w:ilvl w:val="2"/>
+          <w:numId w:val="4"/>
+        </w:numPr>
+      </w:pPr>
+      <w:r>
+        <w:t>See Azam et al. (2013) for how they run and report different regression specifications with different interactions</w:t>
+      </w:r>
+    </w:p>
+    <w:p>
+      <w:pPr>
+        <w:pStyle w:val="ListParagraph"/>
+        <w:numPr>
+          <w:ilvl w:val="2"/>
+          <w:numId w:val="4"/>
+        </w:numPr>
+      </w:pPr>
+      <w:r>
+        <w:t>How to make it so that the no IV specifications have their EMI value in an “EMI” row and the IV specifications have their EMI value in a</w:t>
+      </w:r>
+      <w:r>
+        <w:t>n “EMI (fitted) row”?</w:t>
+      </w:r>
+    </w:p>
+    <w:p>
+      <w:pPr>
+        <w:pStyle w:val="ListParagraph"/>
+        <w:numPr>
+          <w:ilvl w:val="1"/>
+          <w:numId w:val="4"/>
+        </w:numPr>
+      </w:pPr>
+      <w:r>
+        <w:t xml:space="preserve">What if the “best” (e.g., highest AIC) set of controls for the non-IV regression is the same as with the IV regression? </w:t>
+      </w:r>
+    </w:p>
+    <w:p/>
+    <w:p>
+      <w:r>
+        <w:t>Less important changes</w:t>
+      </w:r>
+    </w:p>
+    <w:p>
+      <w:pPr>
+        <w:pStyle w:val="ListParagraph"/>
+        <w:numPr>
+          <w:ilvl w:val="0"/>
+          <w:numId w:val="4"/>
+        </w:numPr>
+      </w:pPr>
+      <w:r>
+        <w:t>Get more control variables into R</w:t>
+      </w:r>
+    </w:p>
+    <w:p>
+      <w:pPr>
+        <w:pStyle w:val="ListParagraph"/>
+        <w:numPr>
+          <w:ilvl w:val="1"/>
+          <w:numId w:val="4"/>
+        </w:numPr>
+      </w:pPr>
+      <w:r>
+        <w:t>In Compacted Notes doc, make note of controls used by relevant papers</w:t>
+      </w:r>
+    </w:p>
+    <w:p>
+      <w:pPr>
+        <w:pStyle w:val="ListParagraph"/>
+        <w:numPr>
+          <w:ilvl w:val="2"/>
+          <w:numId w:val="4"/>
+        </w:numPr>
+      </w:pPr>
+      <w:r>
+        <w:lastRenderedPageBreak/>
+        <w:t>Due to nonmonotonicity in the linguistic distance IV, Shastry (2012) adds in controls which are given in the bottom of p. 298</w:t>
+      </w:r>
+    </w:p>
+    <w:p>
+      <w:pPr>
+        <w:pStyle w:val="ListParagraph"/>
+        <w:numPr>
+          <w:ilvl w:val="2"/>
+          <w:numId w:val="4"/>
+        </w:numPr>
+      </w:pPr>
+      <w:r>
+        <w:t>How did other papers account for migration?</w:t>
+      </w:r>
+    </w:p>
+    <w:p>
+      <w:pPr>
+        <w:pStyle w:val="ListParagraph"/>
+        <w:numPr>
+          <w:ilvl w:val="1"/>
+          <w:numId w:val="4"/>
+        </w:numPr>
+      </w:pPr>
+      <w:r>
+        <w:t>How to account for cohort effects?</w:t>
+      </w:r>
+    </w:p>
+    <w:p>
+      <w:pPr>
+        <w:pStyle w:val="ListParagraph"/>
+        <w:numPr>
+          <w:ilvl w:val="2"/>
+          <w:numId w:val="4"/>
+        </w:numPr>
+      </w:pPr>
+      <w:r>
+        <w:t>Age had strong and very significant negative effect in selection equation</w:t>
+      </w:r>
+    </w:p>
+    <w:p>
+      <w:pPr>
+        <w:pStyle w:val="ListParagraph"/>
+        <w:numPr>
+          <w:ilvl w:val="1"/>
+          <w:numId w:val="4"/>
+        </w:numPr>
+      </w:pPr>
+      <w:r>
+        <w:t>Enrollment effects: Overall enrollment rates (and/or an EMI × enrollment interaction)?</w:t>
+      </w:r>
+    </w:p>
+    <w:p>
+      <w:pPr>
+        <w:pStyle w:val="ListParagraph"/>
+        <w:numPr>
+          <w:ilvl w:val="1"/>
+          <w:numId w:val="4"/>
+        </w:numPr>
+      </w:pPr>
+      <w:proofErr w:type="spellStart"/>
+      <w:r>
+        <w:t>TechFirms</w:t>
+      </w:r>
+      <w:proofErr w:type="spellEnd"/>
+      <w:r>
+        <w:t xml:space="preserve"> </w:t>
+      </w:r>
+    </w:p>
+    <w:p>
+      <w:pPr>
+        <w:pStyle w:val="ListParagraph"/>
+        <w:numPr>
+          <w:ilvl w:val="2"/>
+          <w:numId w:val="4"/>
+        </w:numPr>
+      </w:pPr>
+      <w:r>
+        <w:t>@</w:t>
+      </w:r>
+      <w:r>
+        <w:t>office2019a</w:t>
+      </w:r>
+      <w:r>
+        <w:t>: 2013-14 Economic Census, Number of rows per district whose BACT is in 15-18 or something like that. See the folder to make district name matching easier</w:t>
+      </w:r>
+    </w:p>
+    <w:p>
+      <w:pPr>
+        <w:pStyle w:val="ListParagraph"/>
+        <w:numPr>
+          <w:ilvl w:val="3"/>
+          <w:numId w:val="4"/>
+        </w:numPr>
+      </w:pPr>
+      <w:r>
+        <w:t>Would be endogenously determined by EMI in 2007-08; doesn’t work as a control</w:t>
+      </w:r>
+    </w:p>
+    <w:p>
+      <w:pPr>
+        <w:pStyle w:val="ListParagraph"/>
+        <w:numPr>
+          <w:ilvl w:val="2"/>
+          <w:numId w:val="4"/>
+        </w:numPr>
+      </w:pPr>
+      <w:r>
+        <w:t>@</w:t>
+      </w:r>
+      <w:r>
+        <w:t>centralstatisticsofficeIndiaFifthEconomic2008</w:t>
+      </w:r>
+      <w:r>
+        <w:t xml:space="preserve">: 2005 Economic Census. See Report file for parsing the </w:t>
+      </w:r>
+      <w:proofErr w:type="spellStart"/>
+      <w:r>
+        <w:t>txt</w:t>
+      </w:r>
+      <w:proofErr w:type="spellEnd"/>
+      <w:r>
+        <w:t xml:space="preserve"> files. See Directory file for district codes, see </w:t>
+      </w:r>
+      <w:hyperlink r:id="rId23" w:history="1">
+        <w:r>
+          <w:rPr>
+            <w:rStyle w:val="Hyperlink"/>
+          </w:rPr>
+          <w:t>https://microdata.gov.in/NADA/index.php/catalog/46/data-dictionary</w:t>
+        </w:r>
+      </w:hyperlink>
+      <w:r>
+        <w:t xml:space="preserve"> to orient yourself</w:t>
+      </w:r>
+    </w:p>
+    <w:p>
+      <w:pPr>
+        <w:pStyle w:val="ListParagraph"/>
+        <w:numPr>
+          <w:ilvl w:val="3"/>
+          <w:numId w:val="4"/>
+        </w:numPr>
+      </w:pPr>
+      <w:r>
+        <w:t>Use this one</w:t>
+      </w:r>
+    </w:p>
+    <w:p>
+      <w:pPr>
+        <w:pStyle w:val="ListParagraph"/>
+        <w:numPr>
+          <w:ilvl w:val="2"/>
+          <w:numId w:val="4"/>
+        </w:numPr>
+      </w:pPr>
+      <w:r>
+        <w:t>If can’t find anything, maybe use change in industry and agriculture to; maybe economic activity growth = agricultural growth – industrial growth + service growth, so having the other three variables for growth could let me calculate economic activity growth?</w:t>
+      </w:r>
+    </w:p>
+    <w:p>
+      <w:pPr>
+        <w:pStyle w:val="ListParagraph"/>
+        <w:numPr>
+          <w:ilvl w:val="2"/>
+          <w:numId w:val="4"/>
+        </w:numPr>
+      </w:pPr>
+      <w:r>
+        <w:t>@shastry2012a: Though the EMI premium does exist, districts with the greatest intensity of EMI, and thus with the greatest growth of IT jobs and school enrollment, also experienced the smallest wage premia for English skills. It could be the case, then, that there is a negative association between district-level economic growth and EMI intensity</w:t>
+      </w:r>
+    </w:p>
+    <w:p>
+      <w:pPr>
+        <w:pStyle w:val="ListParagraph"/>
+        <w:numPr>
+          <w:ilvl w:val="1"/>
+          <w:numId w:val="4"/>
+        </w:numPr>
+      </w:pPr>
+      <w:r>
+        <w:t>@shastry2012a:</w:t>
+      </w:r>
+      <w:r>
+        <w:t xml:space="preserve"> State fixed effects should absorb many predictors of IT firm location!</w:t>
+      </w:r>
+    </w:p>
+    <w:p>
+      <w:pPr>
+        <w:pStyle w:val="ListParagraph"/>
+        <w:numPr>
+          <w:ilvl w:val="2"/>
+          <w:numId w:val="4"/>
+        </w:numPr>
+      </w:pPr>
+      <w:r>
+        <w:t xml:space="preserve">“The state fixed effects account for many other predictors of IT firm location, such as state business policies. For example, IT firms may be </w:t>
+      </w:r>
+      <w:r>
+        <w:lastRenderedPageBreak/>
+        <w:t>influenced by labor regulation (Besley and Burgess 2004). This is unlikely because turnover in IT is remarkably high with firms raiding each other and employees migrating abroad. Nevertheless, allowing the effect of labor regulation to differ over time does not alter my results. 29 (p. 306)”</w:t>
+      </w:r>
+    </w:p>
+    <w:p>
+      <w:pPr>
+        <w:pStyle w:val="ListParagraph"/>
+        <w:numPr>
+          <w:ilvl w:val="1"/>
+          <w:numId w:val="4"/>
+        </w:numPr>
+      </w:pPr>
+      <w:r>
+        <w:t>Engineering colleges</w:t>
+      </w:r>
+    </w:p>
+    <w:p>
+      <w:pPr>
+        <w:pStyle w:val="ListParagraph"/>
+        <w:numPr>
+          <w:ilvl w:val="2"/>
+          <w:numId w:val="4"/>
+        </w:numPr>
+      </w:pPr>
+      <w:r>
+        <w:t xml:space="preserve">“In measuring engineering college presence, I count only the 26 elite engineering colleges, because district-level data on all engineering colleges are not of the same quality. Another measure is from the list of accredited engineering programs from the National Board of Accreditation of the </w:t>
       </w:r>
       <w:proofErr w:type="gramStart"/>
       <w:r>
-        <w:t>single-imputation</w:t>
+        <w:t>All India</w:t>
       </w:r>
       <w:proofErr w:type="gramEnd"/>
       <w:r>
-        <w:t xml:space="preserve"> by predictive mean matching, which may understate the uncertainty of imputation</w:t>
-      </w:r>
-    </w:p>
-    <w:p>
-      <w:pPr>
-        <w:pStyle w:val="ListParagraph"/>
-        <w:numPr>
-          <w:ilvl w:val="0"/>
-          <w:numId w:val="4"/>
-        </w:numPr>
-      </w:pPr>
-      <w:r>
-        <w:t>Narrative</w:t>
-      </w:r>
-      <w:r>
-        <w:t>/writing</w:t>
-      </w:r>
-    </w:p>
-    <w:p>
-      <w:pPr>
-        <w:pStyle w:val="ListParagraph"/>
-        <w:numPr>
-          <w:ilvl w:val="1"/>
-          <w:numId w:val="4"/>
-        </w:numPr>
-      </w:pPr>
-      <w:r>
-        <w:t>Tighter introduction</w:t>
+        <w:t xml:space="preserve"> Council for Technical Education. Each program was assigned to a district based on the address of the affiliated college. I only include colleges established prior to 1990. Controlling for this measure does not alter my results” (p. 306)</w:t>
+      </w:r>
+    </w:p>
+    <w:p>
+      <w:pPr>
+        <w:pStyle w:val="ListParagraph"/>
+        <w:numPr>
+          <w:ilvl w:val="1"/>
+          <w:numId w:val="4"/>
+        </w:numPr>
+      </w:pPr>
+      <w:r>
+        <w:t xml:space="preserve">Infrastructure measures beyond </w:t>
+      </w:r>
+      <w:proofErr w:type="spellStart"/>
+      <w:r>
+        <w:t>prop_pucca</w:t>
+      </w:r>
+      <w:proofErr w:type="spellEnd"/>
+      <w:r>
+        <w:t>; perhaps Internet access or electricity access?</w:t>
+      </w:r>
+    </w:p>
+    <w:p>
+      <w:pPr>
+        <w:pStyle w:val="ListParagraph"/>
+        <w:numPr>
+          <w:ilvl w:val="1"/>
+          <w:numId w:val="4"/>
+        </w:numPr>
+      </w:pPr>
+      <w:r>
+        <w:t xml:space="preserve">Corruption indices? Hindi-speaking districts of Central India may be far more corrupt, which likely proxies for having far more false advertising my schools, than other regions of India. </w:t>
       </w:r>
     </w:p>
     <w:p>
@@ -2268,19 +2789,10 @@
         </w:numPr>
       </w:pPr>
       <w:r>
-        <w:t>Maybe separate introduction and literature review? Have introduction be just like a more thorough abstract</w:t>
-      </w:r>
-    </w:p>
-    <w:p>
-      <w:pPr>
-        <w:pStyle w:val="ListParagraph"/>
-        <w:numPr>
-          <w:ilvl w:val="1"/>
-          <w:numId w:val="4"/>
-        </w:numPr>
-      </w:pPr>
-      <w:r>
-        <w:t>Make abstract pop</w:t>
+        <w:t xml:space="preserve">Current framework implicitly assumes corruption, chronic teacher absenteeism, etc. are similar across districts. See Compacted notes for more e.g.: </w:t>
+      </w:r>
+      <w:r>
+        <w:t>Regardless, a desire for EMI alongside better teacher quality amongst poorer households drove a 30% increase in the number of private schools from 2012 to 2020, comprised mostly of low-cost private schools [@gooptu2023a, p. 2]. This change, however, did not seem to change the fact that private schools attract richer households than government schools on average [@muralidharan2015a]</w:t>
       </w:r>
     </w:p>
     <w:p>
@@ -2292,207 +2804,161 @@
         </w:numPr>
       </w:pPr>
       <w:r>
-        <w:t>Highlight empirical methods, findings</w:t>
-      </w:r>
-    </w:p>
-    <w:p>
-      <w:pPr>
-        <w:pStyle w:val="ListParagraph"/>
-        <w:numPr>
-          <w:ilvl w:val="0"/>
-          <w:numId w:val="4"/>
-        </w:numPr>
-      </w:pPr>
-      <w:r>
-        <w:t>Make better maps for probit</w:t>
-      </w:r>
-    </w:p>
-    <w:p>
-      <w:pPr>
-        <w:pStyle w:val="ListParagraph"/>
-        <w:numPr>
-          <w:ilvl w:val="1"/>
-          <w:numId w:val="4"/>
-        </w:numPr>
-      </w:pPr>
-      <w:r>
-        <w:t>Make a map of predicted enrollment propensity by district (maybe via district FE or predicted probabilities).</w:t>
-      </w:r>
-    </w:p>
-    <w:p>
-      <w:pPr>
-        <w:pStyle w:val="ListParagraph"/>
-        <w:numPr>
-          <w:ilvl w:val="1"/>
-          <w:numId w:val="4"/>
-        </w:numPr>
-      </w:pPr>
-      <w:r>
-        <w:t>Make a map of IMR or missingness structure (helps explain measurement/coverage).</w:t>
-      </w:r>
-    </w:p>
-    <w:p>
-      <w:pPr>
-        <w:pStyle w:val="ListParagraph"/>
-        <w:numPr>
-          <w:ilvl w:val="0"/>
-          <w:numId w:val="4"/>
-        </w:numPr>
-      </w:pPr>
-      <w:r>
-        <w:t>Fix EMI and response variable measures</w:t>
-      </w:r>
-    </w:p>
-    <w:p>
-      <w:pPr>
-        <w:pStyle w:val="ListParagraph"/>
-        <w:numPr>
-          <w:ilvl w:val="1"/>
-          <w:numId w:val="4"/>
-        </w:numPr>
-      </w:pPr>
-      <w:r>
-        <w:t xml:space="preserve">Percent change </w:t>
-      </w:r>
-      <w:r>
-        <w:t>measures</w:t>
+        <w:t xml:space="preserve">@shastry2012a, </w:t>
+      </w:r>
+      <w:r>
+        <w:t xml:space="preserve">p. 299: “To ensure that these results are not driven by native Hindi populations in the “Hindi Belt” states with high levels of corruption and government inefficiency, I include an indicator variable for the following states: Bihar, Uttar Pradesh, Uttaranchal, Madhya Pradesh, Chhattisgarh, Haryana, Punjab, Rajasthan, Himachal Pradesh, Jharkhand, </w:t>
+      </w:r>
+      <w:r>
+        <w:lastRenderedPageBreak/>
+        <w:t>Chandigarh, and Delhi.” For regression to show relevance, exclusion restriction of</w:t>
+      </w:r>
+      <w:r>
+        <w:t xml:space="preserve"> weighted average</w:t>
+      </w:r>
+      <w:r>
+        <w:t xml:space="preserve"> linguistic distance on percent EMI</w:t>
+      </w:r>
+      <w:r>
+        <w:t xml:space="preserve"> for each state</w:t>
+      </w:r>
+      <w:r>
+        <w:t>. “</w:t>
+      </w:r>
+      <w:r>
+        <w:t>In addition, I focus on urban areas and include region</w:t>
+      </w:r>
+      <w:r>
+        <w:t>22</w:t>
+      </w:r>
+      <w:r>
+        <w:t xml:space="preserve"> and grade-level fixed effects (primary, upper primary, secondary, and higher secondary).</w:t>
+      </w:r>
+      <w:r>
+        <w:t>”</w:t>
+      </w:r>
+      <w:r>
+        <w:t xml:space="preserve">  </w:t>
+      </w:r>
+    </w:p>
+    <w:p>
+      <w:pPr>
+        <w:pStyle w:val="ListParagraph"/>
+        <w:numPr>
+          <w:ilvl w:val="3"/>
+          <w:numId w:val="4"/>
+        </w:numPr>
+      </w:pPr>
+      <w:r>
+        <w:t>“22. Data on language instruction in school is at the state level since district-level data is unavailable; thus, I am unable to include state fixed effects. I also cluster by state and, due to the small number of states (2</w:t>
+      </w:r>
+      <w:r>
+        <w:t>9</w:t>
       </w:r>
       <w:r>
         <w:t xml:space="preserve"> </w:t>
       </w:r>
       <w:r>
-        <w:t>e.g., %</w:t>
-      </w:r>
-      <w:proofErr w:type="spellStart"/>
-      <w:r>
-        <w:t>ΔConsumption</w:t>
-      </w:r>
-      <w:proofErr w:type="spellEnd"/>
+        <w:t>), adjust my critical values according to Cameron, Miller, and Gelbach (2007): the critical values for the 1 percent, 5 percent, and 10 percent significance levels, drawn from a t-distribution with 27 ( 29 - 2) degrees of freedom, are 2.77, 2.05, and 1.70, respectively</w:t>
+      </w:r>
+      <w:r>
+        <w:t>”</w:t>
+      </w:r>
+    </w:p>
+    <w:p>
+      <w:pPr>
+        <w:pStyle w:val="ListParagraph"/>
+        <w:numPr>
+          <w:ilvl w:val="1"/>
+          <w:numId w:val="4"/>
+        </w:numPr>
+      </w:pPr>
+      <w:r>
+        <w:t>Changes in composition over 2007-2018</w:t>
+      </w:r>
+      <w:r>
+        <w:t xml:space="preserve"> (may be particularly important)</w:t>
+      </w:r>
+    </w:p>
+    <w:p>
+      <w:pPr>
+        <w:pStyle w:val="ListParagraph"/>
+        <w:numPr>
+          <w:ilvl w:val="2"/>
+          <w:numId w:val="4"/>
+        </w:numPr>
+      </w:pPr>
+      <w:r>
+        <w:t>C</w:t>
+      </w:r>
+      <w:r>
+        <w:t>hange in urban</w:t>
+      </w:r>
+      <w:r>
+        <w:t xml:space="preserve"> population</w:t>
+      </w:r>
       <w:r>
         <w:t xml:space="preserve">, </w:t>
       </w:r>
       <w:r>
-        <w:t>as dependent variable</w:t>
-      </w:r>
-      <w:r>
-        <w:t>s</w:t>
-      </w:r>
-      <w:r>
-        <w:t xml:space="preserve"> may be flawed</w:t>
-      </w:r>
-      <w:r>
-        <w:t xml:space="preserve">; perhaps replace with better measures? </w:t>
-      </w:r>
-      <w:r>
-        <w:t xml:space="preserve">See </w:t>
-      </w:r>
-      <w:hyperlink r:id="rId18" w:history="1">
-        <w:r>
-          <w:rPr>
-            <w:rStyle w:val="Hyperlink"/>
-          </w:rPr>
-          <w:t>Using percentage change as a dependent variable? - Cross Validated</w:t>
-        </w:r>
-      </w:hyperlink>
-      <w:r>
-        <w:t xml:space="preserve">, which links to </w:t>
-      </w:r>
-      <w:hyperlink r:id="rId19" w:history="1">
-        <w:r>
-          <w:rPr>
-            <w:rStyle w:val="Hyperlink"/>
-          </w:rPr>
-          <w:t>Linear Regression with a Dependent Variable that is a Ratio - Cross Validated</w:t>
-        </w:r>
-      </w:hyperlink>
-      <w:r>
-        <w:t xml:space="preserve">, which links to </w:t>
-      </w:r>
-      <w:hyperlink r:id="rId20" w:history="1">
-        <w:r>
-          <w:rPr>
-            <w:rStyle w:val="Hyperlink"/>
-          </w:rPr>
-          <w:t xml:space="preserve">Ratios in Regression, aka Questions on </w:t>
-        </w:r>
-        <w:proofErr w:type="spellStart"/>
-        <w:r>
-          <w:rPr>
-            <w:rStyle w:val="Hyperlink"/>
-          </w:rPr>
-          <w:t>Kronmal</w:t>
-        </w:r>
-        <w:proofErr w:type="spellEnd"/>
-        <w:r>
-          <w:rPr>
-            <w:rStyle w:val="Hyperlink"/>
-          </w:rPr>
-          <w:t xml:space="preserve"> - Cross Validated</w:t>
-        </w:r>
-      </w:hyperlink>
-      <w:r>
-        <w:t xml:space="preserve"> and, more importantly, </w:t>
-      </w:r>
-      <w:hyperlink r:id="rId21" w:history="1">
-        <w:r>
-          <w:rPr>
-            <w:rStyle w:val="Hyperlink"/>
-          </w:rPr>
-          <w:t>Spurious Correlation and the Fallacy of the Ratio Standard Revisited</w:t>
-        </w:r>
-      </w:hyperlink>
-      <w:r>
-        <w:t xml:space="preserve">. Also see </w:t>
-      </w:r>
-      <w:hyperlink r:id="rId22" w:history="1">
-        <w:r>
-          <w:rPr>
-            <w:rStyle w:val="Hyperlink"/>
-          </w:rPr>
-          <w:t>Prediction of Percent Change in Linear Regression by Correlated Variables</w:t>
-        </w:r>
-      </w:hyperlink>
-    </w:p>
-    <w:p>
-      <w:pPr>
-        <w:pStyle w:val="ListParagraph"/>
-        <w:numPr>
-          <w:ilvl w:val="0"/>
-          <w:numId w:val="4"/>
-        </w:numPr>
-      </w:pPr>
-      <w:r>
-        <w:t>Regressions: Report multiple specifications</w:t>
-      </w:r>
-    </w:p>
-    <w:p>
-      <w:pPr>
-        <w:pStyle w:val="ListParagraph"/>
-        <w:numPr>
-          <w:ilvl w:val="1"/>
-          <w:numId w:val="4"/>
-        </w:numPr>
-      </w:pPr>
-      <w:r>
-        <w:t>Research h</w:t>
-      </w:r>
-      <w:r>
-        <w:t>ow to report multiple regression specifications in the same table</w:t>
-      </w:r>
-      <w:r>
-        <w:t>.</w:t>
-      </w:r>
-    </w:p>
-    <w:p>
-      <w:pPr>
-        <w:pStyle w:val="ListParagraph"/>
-        <w:numPr>
-          <w:ilvl w:val="1"/>
-          <w:numId w:val="4"/>
-        </w:numPr>
-      </w:pPr>
-      <w:r>
-        <w:t>First have no IV and no controls, then no IV and all controls except for the average IMR, then no IV and all controls including the average IMR, then IV and no controls, then IV and all controls except for the average IMR, then IV and all controls including the average IMR? Would six specifications like this fit best vertically or horizontally on a page? How could I make it so that the table neatly flows onto multiple pages as needed?</w:t>
+        <w:t xml:space="preserve">change in </w:t>
+      </w:r>
+      <w:r>
+        <w:t>caste make-up</w:t>
+      </w:r>
+      <w:r>
+        <w:t>, etc.</w:t>
+      </w:r>
+    </w:p>
+    <w:p>
+      <w:pPr>
+        <w:pStyle w:val="ListParagraph"/>
+        <w:numPr>
+          <w:ilvl w:val="1"/>
+          <w:numId w:val="4"/>
+        </w:numPr>
+      </w:pPr>
+      <w:r>
+        <w:t>Other mechanisms and confounders of EMI’s effect on economic well-being?</w:t>
+      </w:r>
+    </w:p>
+    <w:p>
+      <w:pPr>
+        <w:pStyle w:val="ListParagraph"/>
+        <w:numPr>
+          <w:ilvl w:val="1"/>
+          <w:numId w:val="4"/>
+        </w:numPr>
+      </w:pPr>
+      <w:r>
+        <w:t>@shastry2012a find educational attainment and economic returns higher for those in EMI</w:t>
+      </w:r>
+      <w:r>
+        <w:t xml:space="preserve"> </w:t>
+      </w:r>
+    </w:p>
+    <w:p>
+      <w:pPr>
+        <w:pStyle w:val="ListParagraph"/>
+        <w:numPr>
+          <w:ilvl w:val="0"/>
+          <w:numId w:val="4"/>
+        </w:numPr>
+      </w:pPr>
+      <w:r>
+        <w:t>Get more response variables</w:t>
+      </w:r>
+    </w:p>
+    <w:p>
+      <w:pPr>
+        <w:pStyle w:val="ListParagraph"/>
+        <w:numPr>
+          <w:ilvl w:val="1"/>
+          <w:numId w:val="4"/>
+        </w:numPr>
+      </w:pPr>
+      <w:r>
+        <w:t>In emp0708b5:</w:t>
       </w:r>
     </w:p>
     <w:p>
@@ -2504,608 +2970,82 @@
         </w:numPr>
       </w:pPr>
       <w:r>
+        <w:t>Average wage in 2007-08</w:t>
+      </w:r>
+    </w:p>
+    <w:p>
+      <w:pPr>
+        <w:pStyle w:val="ListParagraph"/>
+        <w:numPr>
+          <w:ilvl w:val="2"/>
+          <w:numId w:val="4"/>
+        </w:numPr>
+      </w:pPr>
+      <w:r>
+        <w:t>Proportion employed in 2007-08</w:t>
+      </w:r>
+    </w:p>
+    <w:p>
+      <w:pPr>
+        <w:pStyle w:val="ListParagraph"/>
+        <w:numPr>
+          <w:ilvl w:val="1"/>
+          <w:numId w:val="4"/>
+        </w:numPr>
+      </w:pPr>
+      <w:r>
+        <w:t>See Undergraduate Research Symposium (URS) presentation</w:t>
+      </w:r>
+      <w:r>
+        <w:t xml:space="preserve"> for full list of potential response variables</w:t>
+      </w:r>
+    </w:p>
+    <w:p>
+      <w:pPr>
+        <w:pStyle w:val="ListParagraph"/>
+        <w:numPr>
+          <w:ilvl w:val="1"/>
+          <w:numId w:val="4"/>
+        </w:numPr>
+      </w:pPr>
+      <w:r>
+        <w:t>Get wages, Gini coefficient of wages, employment, HDI</w:t>
+      </w:r>
+    </w:p>
+    <w:p>
+      <w:pPr>
+        <w:pStyle w:val="ListParagraph"/>
+        <w:numPr>
+          <w:ilvl w:val="2"/>
+          <w:numId w:val="4"/>
+        </w:numPr>
+      </w:pPr>
+      <w:r>
+        <w:t>Once HDI data has been entered in and matched via districts; if there are differences between the 2005-06 and 2019-20-21 districts, see which ones match the HDI data. Create a loop which, for example, takes the districts without matches in 2005 and looks for matches in 2006.</w:t>
+      </w:r>
+    </w:p>
+    <w:p>
+      <w:pPr>
+        <w:pStyle w:val="ListParagraph"/>
+        <w:numPr>
+          <w:ilvl w:val="2"/>
+          <w:numId w:val="4"/>
+        </w:numPr>
+      </w:pPr>
+      <w:r>
+        <w:t>In general, check to see if the right number of districts are there</w:t>
+      </w:r>
+    </w:p>
+    <w:p>
+      <w:pPr>
+        <w:pStyle w:val="ListParagraph"/>
+        <w:numPr>
+          <w:ilvl w:val="2"/>
+          <w:numId w:val="4"/>
+        </w:numPr>
+      </w:pPr>
+      <w:r>
         <w:lastRenderedPageBreak/>
-        <w:t>See Azam et al. (2013) for how they run and report different regression specifications with different interactions</w:t>
-      </w:r>
-    </w:p>
-    <w:p>
-      <w:pPr>
-        <w:pStyle w:val="ListParagraph"/>
-        <w:numPr>
-          <w:ilvl w:val="2"/>
-          <w:numId w:val="4"/>
-        </w:numPr>
-      </w:pPr>
-      <w:r>
-        <w:t>How to make it so that the no IV specifications have their EMI value in an “EMI” row and the IV specifications have their EMI value in a</w:t>
-      </w:r>
-      <w:r>
-        <w:t>n “EMI (fitted) row”?</w:t>
-      </w:r>
-    </w:p>
-    <w:p>
-      <w:pPr>
-        <w:pStyle w:val="ListParagraph"/>
-        <w:numPr>
-          <w:ilvl w:val="1"/>
-          <w:numId w:val="4"/>
-        </w:numPr>
-      </w:pPr>
-      <w:r>
-        <w:t xml:space="preserve">What if the “best” (e.g., highest AIC) set of controls for the non-IV regression is the same as with the IV regression? </w:t>
-      </w:r>
-    </w:p>
-    <w:p/>
-    <w:p>
-      <w:r>
-        <w:t>Less important changes</w:t>
-      </w:r>
-    </w:p>
-    <w:p>
-      <w:pPr>
-        <w:pStyle w:val="ListParagraph"/>
-        <w:numPr>
-          <w:ilvl w:val="0"/>
-          <w:numId w:val="4"/>
-        </w:numPr>
-      </w:pPr>
-      <w:r>
-        <w:t>Get more control variables into R</w:t>
-      </w:r>
-    </w:p>
-    <w:p>
-      <w:pPr>
-        <w:pStyle w:val="ListParagraph"/>
-        <w:numPr>
-          <w:ilvl w:val="1"/>
-          <w:numId w:val="4"/>
-        </w:numPr>
-      </w:pPr>
-      <w:r>
-        <w:t>In Compacted Notes doc, make note of controls used by relevant papers</w:t>
-      </w:r>
-    </w:p>
-    <w:p>
-      <w:pPr>
-        <w:pStyle w:val="ListParagraph"/>
-        <w:numPr>
-          <w:ilvl w:val="2"/>
-          <w:numId w:val="4"/>
-        </w:numPr>
-      </w:pPr>
-      <w:r>
-        <w:t>Due to nonmonotonicity in the linguistic distance IV, Shastry (2012) adds in controls which are given in the bottom of p. 298</w:t>
-      </w:r>
-    </w:p>
-    <w:p>
-      <w:pPr>
-        <w:pStyle w:val="ListParagraph"/>
-        <w:numPr>
-          <w:ilvl w:val="2"/>
-          <w:numId w:val="4"/>
-        </w:numPr>
-      </w:pPr>
-      <w:r>
-        <w:t>How did other papers account for migration?</w:t>
-      </w:r>
-    </w:p>
-    <w:p>
-      <w:pPr>
-        <w:pStyle w:val="ListParagraph"/>
-        <w:numPr>
-          <w:ilvl w:val="1"/>
-          <w:numId w:val="4"/>
-        </w:numPr>
-      </w:pPr>
-      <w:r>
-        <w:t>How to account for cohort effects?</w:t>
-      </w:r>
-    </w:p>
-    <w:p>
-      <w:pPr>
-        <w:pStyle w:val="ListParagraph"/>
-        <w:numPr>
-          <w:ilvl w:val="2"/>
-          <w:numId w:val="4"/>
-        </w:numPr>
-      </w:pPr>
-      <w:r>
-        <w:t>Age had strong and very significant negative effect in selection equation</w:t>
-      </w:r>
-    </w:p>
-    <w:p>
-      <w:pPr>
-        <w:pStyle w:val="ListParagraph"/>
-        <w:numPr>
-          <w:ilvl w:val="1"/>
-          <w:numId w:val="4"/>
-        </w:numPr>
-      </w:pPr>
-      <w:r>
-        <w:t>Enrollment effects: Overall enrollment rates (and/or an EMI × enrollment interaction)?</w:t>
-      </w:r>
-    </w:p>
-    <w:p>
-      <w:pPr>
-        <w:pStyle w:val="ListParagraph"/>
-        <w:numPr>
-          <w:ilvl w:val="1"/>
-          <w:numId w:val="4"/>
-        </w:numPr>
-      </w:pPr>
-      <w:proofErr w:type="spellStart"/>
-      <w:r>
-        <w:t>TechFirms</w:t>
-      </w:r>
-      <w:proofErr w:type="spellEnd"/>
-      <w:r>
-        <w:t xml:space="preserve"> </w:t>
-      </w:r>
-    </w:p>
-    <w:p>
-      <w:pPr>
-        <w:pStyle w:val="ListParagraph"/>
-        <w:numPr>
-          <w:ilvl w:val="2"/>
-          <w:numId w:val="4"/>
-        </w:numPr>
-      </w:pPr>
-      <w:r>
-        <w:t>@</w:t>
-      </w:r>
-      <w:r>
-        <w:t>office2019a</w:t>
-      </w:r>
-      <w:r>
-        <w:t>: 2013-14 Economic Census, Number of rows per district whose BACT is in 15-18 or something like that. See the folder to make district name matching easier</w:t>
-      </w:r>
-    </w:p>
-    <w:p>
-      <w:pPr>
-        <w:pStyle w:val="ListParagraph"/>
-        <w:numPr>
-          <w:ilvl w:val="3"/>
-          <w:numId w:val="4"/>
-        </w:numPr>
-      </w:pPr>
-      <w:r>
-        <w:t>Would be endogenously determined by EMI in 2007-08; doesn’t work as a control</w:t>
-      </w:r>
-    </w:p>
-    <w:p>
-      <w:pPr>
-        <w:pStyle w:val="ListParagraph"/>
-        <w:numPr>
-          <w:ilvl w:val="2"/>
-          <w:numId w:val="4"/>
-        </w:numPr>
-      </w:pPr>
-      <w:r>
-        <w:t>@</w:t>
-      </w:r>
-      <w:r>
-        <w:t>centralstatisticsofficeIndiaFifthEconomic2008</w:t>
-      </w:r>
-      <w:r>
-        <w:t xml:space="preserve">: 2005 Economic Census. See Report file for parsing the </w:t>
-      </w:r>
-      <w:proofErr w:type="spellStart"/>
-      <w:r>
-        <w:t>txt</w:t>
-      </w:r>
-      <w:proofErr w:type="spellEnd"/>
-      <w:r>
-        <w:t xml:space="preserve"> files. See Directory file for district codes, see </w:t>
-      </w:r>
-      <w:hyperlink r:id="rId23" w:history="1">
-        <w:r>
-          <w:rPr>
-            <w:rStyle w:val="Hyperlink"/>
-          </w:rPr>
-          <w:t>https://microdata.gov.in/NADA/index.php/catalog/46/data-dictionary</w:t>
-        </w:r>
-      </w:hyperlink>
-      <w:r>
-        <w:t xml:space="preserve"> to orient yourself</w:t>
-      </w:r>
-    </w:p>
-    <w:p>
-      <w:pPr>
-        <w:pStyle w:val="ListParagraph"/>
-        <w:numPr>
-          <w:ilvl w:val="3"/>
-          <w:numId w:val="4"/>
-        </w:numPr>
-      </w:pPr>
-      <w:r>
-        <w:t>Use this one</w:t>
-      </w:r>
-    </w:p>
-    <w:p>
-      <w:pPr>
-        <w:pStyle w:val="ListParagraph"/>
-        <w:numPr>
-          <w:ilvl w:val="2"/>
-          <w:numId w:val="4"/>
-        </w:numPr>
-      </w:pPr>
-      <w:r>
-        <w:t xml:space="preserve">If can’t find anything, maybe use change in industry and agriculture to; maybe economic activity growth = agricultural growth – industrial growth </w:t>
-      </w:r>
-      <w:r>
-        <w:lastRenderedPageBreak/>
-        <w:t>+ service growth, so having the other three variables for growth could let me calculate economic activity growth?</w:t>
-      </w:r>
-    </w:p>
-    <w:p>
-      <w:pPr>
-        <w:pStyle w:val="ListParagraph"/>
-        <w:numPr>
-          <w:ilvl w:val="2"/>
-          <w:numId w:val="4"/>
-        </w:numPr>
-      </w:pPr>
-      <w:r>
-        <w:t>@shastry2012a: Though the EMI premium does exist, districts with the greatest intensity of EMI, and thus with the greatest growth of IT jobs and school enrollment, also experienced the smallest wage premia for English skills. It could be the case, then, that there is a negative association between district-level economic growth and EMI intensity</w:t>
-      </w:r>
-    </w:p>
-    <w:p>
-      <w:pPr>
-        <w:pStyle w:val="ListParagraph"/>
-        <w:numPr>
-          <w:ilvl w:val="1"/>
-          <w:numId w:val="4"/>
-        </w:numPr>
-      </w:pPr>
-      <w:r>
-        <w:t>@shastry2012a:</w:t>
-      </w:r>
-      <w:r>
-        <w:t xml:space="preserve"> State fixed effects should absorb many predictors of IT firm location!</w:t>
-      </w:r>
-    </w:p>
-    <w:p>
-      <w:pPr>
-        <w:pStyle w:val="ListParagraph"/>
-        <w:numPr>
-          <w:ilvl w:val="2"/>
-          <w:numId w:val="4"/>
-        </w:numPr>
-      </w:pPr>
-      <w:r>
-        <w:t>“The state fixed effects account for many other predictors of IT firm location, such as state business policies. For example, IT firms may be influenced by labor regulation (Besley and Burgess 2004). This is unlikely because turnover in IT is remarkably high with firms raiding each other and employees migrating abroad. Nevertheless, allowing the effect of labor regulation to differ over time does not alter my results. 29 (p. 306)”</w:t>
-      </w:r>
-    </w:p>
-    <w:p>
-      <w:pPr>
-        <w:pStyle w:val="ListParagraph"/>
-        <w:numPr>
-          <w:ilvl w:val="1"/>
-          <w:numId w:val="4"/>
-        </w:numPr>
-      </w:pPr>
-      <w:r>
-        <w:t>Engineering colleges</w:t>
-      </w:r>
-    </w:p>
-    <w:p>
-      <w:pPr>
-        <w:pStyle w:val="ListParagraph"/>
-        <w:numPr>
-          <w:ilvl w:val="2"/>
-          <w:numId w:val="4"/>
-        </w:numPr>
-      </w:pPr>
-      <w:r>
-        <w:t xml:space="preserve">“In measuring engineering college presence, I count only the 26 elite engineering colleges, because district-level data on all engineering colleges are not of the same quality. Another measure is from the list of accredited engineering programs from the National Board of Accreditation of the </w:t>
-      </w:r>
-      <w:proofErr w:type="gramStart"/>
-      <w:r>
-        <w:t>All India</w:t>
-      </w:r>
-      <w:proofErr w:type="gramEnd"/>
-      <w:r>
-        <w:t xml:space="preserve"> Council for Technical Education. Each program was assigned to a district based on the address of the affiliated college. I only include colleges established prior to 1990. Controlling for this measure does not alter my results” (p. 306)</w:t>
-      </w:r>
-    </w:p>
-    <w:p>
-      <w:pPr>
-        <w:pStyle w:val="ListParagraph"/>
-        <w:numPr>
-          <w:ilvl w:val="1"/>
-          <w:numId w:val="4"/>
-        </w:numPr>
-      </w:pPr>
-      <w:r>
-        <w:t xml:space="preserve">Infrastructure measures beyond </w:t>
-      </w:r>
-      <w:proofErr w:type="spellStart"/>
-      <w:r>
-        <w:t>prop_pucca</w:t>
-      </w:r>
-      <w:proofErr w:type="spellEnd"/>
-      <w:r>
-        <w:t>; perhaps Internet access or electricity access?</w:t>
-      </w:r>
-    </w:p>
-    <w:p>
-      <w:pPr>
-        <w:pStyle w:val="ListParagraph"/>
-        <w:numPr>
-          <w:ilvl w:val="1"/>
-          <w:numId w:val="4"/>
-        </w:numPr>
-      </w:pPr>
-      <w:r>
-        <w:t xml:space="preserve">Corruption indices? Hindi-speaking districts of Central India may be far more corrupt, which likely proxies for having far more false advertising my schools, than other regions of India. </w:t>
-      </w:r>
-    </w:p>
-    <w:p>
-      <w:pPr>
-        <w:pStyle w:val="ListParagraph"/>
-        <w:numPr>
-          <w:ilvl w:val="2"/>
-          <w:numId w:val="4"/>
-        </w:numPr>
-      </w:pPr>
-      <w:r>
-        <w:t xml:space="preserve">Current framework implicitly assumes corruption, chronic teacher absenteeism, etc. are similar across districts. See Compacted notes for </w:t>
-      </w:r>
-      <w:r>
-        <w:lastRenderedPageBreak/>
-        <w:t xml:space="preserve">more e.g.: </w:t>
-      </w:r>
-      <w:r>
-        <w:t>Regardless, a desire for EMI alongside better teacher quality amongst poorer households drove a 30% increase in the number of private schools from 2012 to 2020, comprised mostly of low-cost private schools [@gooptu2023a, p. 2]. This change, however, did not seem to change the fact that private schools attract richer households than government schools on average [@muralidharan2015a]</w:t>
-      </w:r>
-    </w:p>
-    <w:p>
-      <w:pPr>
-        <w:pStyle w:val="ListParagraph"/>
-        <w:numPr>
-          <w:ilvl w:val="2"/>
-          <w:numId w:val="4"/>
-        </w:numPr>
-      </w:pPr>
-      <w:r>
-        <w:t xml:space="preserve">@shastry2012a, </w:t>
-      </w:r>
-      <w:r>
-        <w:t>p. 299: “To ensure that these results are not driven by native Hindi populations in the “Hindi Belt” states with high levels of corruption and government inefficiency, I include an indicator variable for the following states: Bihar, Uttar Pradesh, Uttaranchal, Madhya Pradesh, Chhattisgarh, Haryana, Punjab, Rajasthan, Himachal Pradesh, Jharkhand, Chandigarh, and Delhi.” For regression to show relevance, exclusion restriction of</w:t>
-      </w:r>
-      <w:r>
-        <w:t xml:space="preserve"> weighted average</w:t>
-      </w:r>
-      <w:r>
-        <w:t xml:space="preserve"> linguistic distance on percent EMI</w:t>
-      </w:r>
-      <w:r>
-        <w:t xml:space="preserve"> for each state</w:t>
-      </w:r>
-      <w:r>
-        <w:t>. “</w:t>
-      </w:r>
-      <w:r>
-        <w:t>In addition, I focus on urban areas and include region</w:t>
-      </w:r>
-      <w:r>
-        <w:t>22</w:t>
-      </w:r>
-      <w:r>
-        <w:t xml:space="preserve"> and grade-level fixed effects (primary, upper primary, secondary, and higher secondary).</w:t>
-      </w:r>
-      <w:r>
-        <w:t>”</w:t>
-      </w:r>
-      <w:r>
-        <w:t xml:space="preserve">  </w:t>
-      </w:r>
-    </w:p>
-    <w:p>
-      <w:pPr>
-        <w:pStyle w:val="ListParagraph"/>
-        <w:numPr>
-          <w:ilvl w:val="3"/>
-          <w:numId w:val="4"/>
-        </w:numPr>
-      </w:pPr>
-      <w:r>
-        <w:t>“22. Data on language instruction in school is at the state level since district-level data is unavailable; thus, I am unable to include state fixed effects. I also cluster by state and, due to the small number of states (2</w:t>
-      </w:r>
-      <w:r>
-        <w:t>9</w:t>
-      </w:r>
-      <w:r>
-        <w:t xml:space="preserve"> </w:t>
-      </w:r>
-      <w:r>
-        <w:t>), adjust my critical values according to Cameron, Miller, and Gelbach (2007): the critical values for the 1 percent, 5 percent, and 10 percent significance levels, drawn from a t-distribution with 27 ( 29 - 2) degrees of freedom, are 2.77, 2.05, and 1.70, respectively</w:t>
-      </w:r>
-      <w:r>
-        <w:t>”</w:t>
-      </w:r>
-    </w:p>
-    <w:p>
-      <w:pPr>
-        <w:pStyle w:val="ListParagraph"/>
-        <w:numPr>
-          <w:ilvl w:val="1"/>
-          <w:numId w:val="4"/>
-        </w:numPr>
-      </w:pPr>
-      <w:r>
-        <w:t>Changes in composition over 2007-2018</w:t>
-      </w:r>
-      <w:r>
-        <w:t xml:space="preserve"> (may be particularly important)</w:t>
-      </w:r>
-    </w:p>
-    <w:p>
-      <w:pPr>
-        <w:pStyle w:val="ListParagraph"/>
-        <w:numPr>
-          <w:ilvl w:val="2"/>
-          <w:numId w:val="4"/>
-        </w:numPr>
-      </w:pPr>
-      <w:r>
-        <w:t>C</w:t>
-      </w:r>
-      <w:r>
-        <w:t>hange in urban</w:t>
-      </w:r>
-      <w:r>
-        <w:t xml:space="preserve"> population</w:t>
-      </w:r>
-      <w:r>
-        <w:t xml:space="preserve">, </w:t>
-      </w:r>
-      <w:r>
-        <w:t xml:space="preserve">change in </w:t>
-      </w:r>
-      <w:r>
-        <w:t>caste make-up</w:t>
-      </w:r>
-      <w:r>
-        <w:t>, etc.</w:t>
-      </w:r>
-    </w:p>
-    <w:p>
-      <w:pPr>
-        <w:pStyle w:val="ListParagraph"/>
-        <w:numPr>
-          <w:ilvl w:val="1"/>
-          <w:numId w:val="4"/>
-        </w:numPr>
-      </w:pPr>
-      <w:r>
-        <w:t>Other mechanisms and confounders of EMI’s effect on economic well-being?</w:t>
-      </w:r>
-    </w:p>
-    <w:p>
-      <w:pPr>
-        <w:pStyle w:val="ListParagraph"/>
-        <w:numPr>
-          <w:ilvl w:val="1"/>
-          <w:numId w:val="4"/>
-        </w:numPr>
-      </w:pPr>
-      <w:r>
-        <w:t>@shastry2012a find educational attainment and economic returns higher for those in EMI</w:t>
-      </w:r>
-      <w:r>
-        <w:t xml:space="preserve"> </w:t>
-      </w:r>
-    </w:p>
-    <w:p>
-      <w:pPr>
-        <w:pStyle w:val="ListParagraph"/>
-        <w:numPr>
-          <w:ilvl w:val="0"/>
-          <w:numId w:val="4"/>
-        </w:numPr>
-      </w:pPr>
-      <w:r>
-        <w:t>Get more response variables</w:t>
-      </w:r>
-    </w:p>
-    <w:p>
-      <w:pPr>
-        <w:pStyle w:val="ListParagraph"/>
-        <w:numPr>
-          <w:ilvl w:val="1"/>
-          <w:numId w:val="4"/>
-        </w:numPr>
-      </w:pPr>
-      <w:r>
-        <w:t>In emp0708b5:</w:t>
-      </w:r>
-    </w:p>
-    <w:p>
-      <w:pPr>
-        <w:pStyle w:val="ListParagraph"/>
-        <w:numPr>
-          <w:ilvl w:val="2"/>
-          <w:numId w:val="4"/>
-        </w:numPr>
-      </w:pPr>
-      <w:r>
-        <w:lastRenderedPageBreak/>
-        <w:t>Average wage in 2007-08</w:t>
-      </w:r>
-    </w:p>
-    <w:p>
-      <w:pPr>
-        <w:pStyle w:val="ListParagraph"/>
-        <w:numPr>
-          <w:ilvl w:val="2"/>
-          <w:numId w:val="4"/>
-        </w:numPr>
-      </w:pPr>
-      <w:r>
-        <w:t>Proportion employed in 2007-08</w:t>
-      </w:r>
-    </w:p>
-    <w:p>
-      <w:pPr>
-        <w:pStyle w:val="ListParagraph"/>
-        <w:numPr>
-          <w:ilvl w:val="1"/>
-          <w:numId w:val="4"/>
-        </w:numPr>
-      </w:pPr>
-      <w:r>
-        <w:t>See Undergraduate Research Symposium (URS) presentation</w:t>
-      </w:r>
-      <w:r>
-        <w:t xml:space="preserve"> for full list of potential response variables</w:t>
-      </w:r>
-    </w:p>
-    <w:p>
-      <w:pPr>
-        <w:pStyle w:val="ListParagraph"/>
-        <w:numPr>
-          <w:ilvl w:val="1"/>
-          <w:numId w:val="4"/>
-        </w:numPr>
-      </w:pPr>
-      <w:r>
-        <w:t>Get wages, Gini coefficient of wages, employment, HDI</w:t>
-      </w:r>
-    </w:p>
-    <w:p>
-      <w:pPr>
-        <w:pStyle w:val="ListParagraph"/>
-        <w:numPr>
-          <w:ilvl w:val="2"/>
-          <w:numId w:val="4"/>
-        </w:numPr>
-      </w:pPr>
-      <w:r>
-        <w:t>Once HDI data has been entered in and matched via districts; if there are differences between the 2005-06 and 2019-20-21 districts, see which ones match the HDI data. Create a loop which, for example, takes the districts without matches in 2005 and looks for matches in 2006.</w:t>
-      </w:r>
-    </w:p>
-    <w:p>
-      <w:pPr>
-        <w:pStyle w:val="ListParagraph"/>
-        <w:numPr>
-          <w:ilvl w:val="2"/>
-          <w:numId w:val="4"/>
-        </w:numPr>
-      </w:pPr>
-      <w:r>
-        <w:t>In general, check to see if the right number of districts are there</w:t>
-      </w:r>
-    </w:p>
-    <w:p>
-      <w:pPr>
-        <w:pStyle w:val="ListParagraph"/>
-        <w:numPr>
-          <w:ilvl w:val="2"/>
-          <w:numId w:val="4"/>
-        </w:numPr>
-      </w:pPr>
-      <w:r>
         <w:t xml:space="preserve">Check to see if HDI still inaccessible: </w:t>
       </w:r>
       <w:hyperlink r:id="rId24" w:history="1">
@@ -3246,59 +3186,59 @@
         </w:numPr>
       </w:pPr>
       <w:r>
-        <w:t xml:space="preserve">Make sure DIST_FROM_NEAREST_PRIMARY_CLASS in participation equation is either properly labeled (so readers know it is not distance from nearest school overall) or replace it with distance to the nearest school or the nearest </w:t>
+        <w:t>Make sure DIST_FROM_NEAREST_PRIMARY_CLASS in participation equation is either properly labeled (so readers know it is not distance from nearest school overall) or replace it with distance to the nearest school or the nearest school which would be where the student would go if they were to enroll right now</w:t>
+      </w:r>
+    </w:p>
+    <w:p>
+      <w:pPr>
+        <w:pStyle w:val="ListParagraph"/>
+        <w:numPr>
+          <w:ilvl w:val="1"/>
+          <w:numId w:val="4"/>
+        </w:numPr>
+      </w:pPr>
+      <w:r>
+        <w:t>Maybe include parental education == “Other” in reference group alongside “Illiterate”</w:t>
+      </w:r>
+    </w:p>
+    <w:p>
+      <w:pPr>
+        <w:pStyle w:val="ListParagraph"/>
+        <w:numPr>
+          <w:ilvl w:val="1"/>
+          <w:numId w:val="4"/>
+        </w:numPr>
+      </w:pPr>
+      <w:r>
+        <w:t xml:space="preserve">Instead of just distance to nearest primary class, include distance nearest school of the level kids their age would normally be attending? </w:t>
+      </w:r>
+    </w:p>
+    <w:p>
+      <w:pPr>
+        <w:pStyle w:val="ListParagraph"/>
+        <w:numPr>
+          <w:ilvl w:val="2"/>
+          <w:numId w:val="4"/>
+        </w:numPr>
+      </w:pPr>
+      <w:r>
+        <w:t>Distance from nearest upper primary and secondary class also have much more variation (but also a few more NAs) than from nearest primary class, where 91.7% of rows have a value of 1</w:t>
+      </w:r>
+    </w:p>
+    <w:p>
+      <w:pPr>
+        <w:pStyle w:val="ListParagraph"/>
+        <w:numPr>
+          <w:ilvl w:val="1"/>
+          <w:numId w:val="4"/>
+        </w:numPr>
+      </w:pPr>
+      <w:r>
+        <w:t xml:space="preserve">Tuition was not waived for 94% of observations, scholarships were not received for 90% of observations, and free stationary was not given for 92% of </w:t>
       </w:r>
       <w:r>
         <w:lastRenderedPageBreak/>
-        <w:t>school which would be where the student would go if they were to enroll right now</w:t>
-      </w:r>
-    </w:p>
-    <w:p>
-      <w:pPr>
-        <w:pStyle w:val="ListParagraph"/>
-        <w:numPr>
-          <w:ilvl w:val="1"/>
-          <w:numId w:val="4"/>
-        </w:numPr>
-      </w:pPr>
-      <w:r>
-        <w:t>Maybe include parental education == “Other” in reference group alongside “Illiterate”</w:t>
-      </w:r>
-    </w:p>
-    <w:p>
-      <w:pPr>
-        <w:pStyle w:val="ListParagraph"/>
-        <w:numPr>
-          <w:ilvl w:val="1"/>
-          <w:numId w:val="4"/>
-        </w:numPr>
-      </w:pPr>
-      <w:r>
-        <w:t xml:space="preserve">Instead of just distance to nearest primary class, include distance nearest school of the level kids their age would normally be attending? </w:t>
-      </w:r>
-    </w:p>
-    <w:p>
-      <w:pPr>
-        <w:pStyle w:val="ListParagraph"/>
-        <w:numPr>
-          <w:ilvl w:val="2"/>
-          <w:numId w:val="4"/>
-        </w:numPr>
-      </w:pPr>
-      <w:r>
-        <w:t>Distance from nearest upper primary and secondary class also have much more variation (but also a few more NAs) than from nearest primary class, where 91.7% of rows have a value of 1</w:t>
-      </w:r>
-    </w:p>
-    <w:p>
-      <w:pPr>
-        <w:pStyle w:val="ListParagraph"/>
-        <w:numPr>
-          <w:ilvl w:val="1"/>
-          <w:numId w:val="4"/>
-        </w:numPr>
-      </w:pPr>
-      <w:r>
-        <w:t>Tuition was not waived for 94% of observations, scholarships were not received for 90% of observations, and free stationary was not given for 92% of observations. See what happens when these variables are removed; does anything change?</w:t>
+        <w:t>observations. See what happens when these variables are removed; does anything change?</w:t>
       </w:r>
     </w:p>
     <w:p>
@@ -3461,102 +3401,102 @@
         </w:numPr>
       </w:pPr>
       <w:r>
+        <w:t xml:space="preserve">Are there any benefits to having multiple </w:t>
+      </w:r>
+      <w:proofErr w:type="gramStart"/>
+      <w:r>
+        <w:t>IV’s</w:t>
+      </w:r>
+      <w:proofErr w:type="gramEnd"/>
+      <w:r>
+        <w:t>? If so, run an overidentification test</w:t>
+      </w:r>
+    </w:p>
+    <w:p>
+      <w:pPr>
+        <w:pStyle w:val="ListParagraph"/>
+        <w:numPr>
+          <w:ilvl w:val="0"/>
+          <w:numId w:val="4"/>
+        </w:numPr>
+      </w:pPr>
+      <w:r>
+        <w:t xml:space="preserve">See if spatial spillovers </w:t>
+      </w:r>
+      <w:r>
+        <w:t xml:space="preserve">(migration, commuting students, commuting workers) </w:t>
+      </w:r>
+      <w:r>
+        <w:t>matter</w:t>
+      </w:r>
+    </w:p>
+    <w:p>
+      <w:pPr>
+        <w:pStyle w:val="ListParagraph"/>
+        <w:numPr>
+          <w:ilvl w:val="1"/>
+          <w:numId w:val="4"/>
+        </w:numPr>
+      </w:pPr>
+      <w:r>
+        <w:t>Was I able to find 2007-08 shapefiles or other solutions to fix my district matching methodology?</w:t>
+      </w:r>
+      <w:r>
+        <w:t xml:space="preserve"> Maybe merge polygons of 2020 districts which have the same district and state name in district_08</w:t>
+      </w:r>
+      <w:r>
+        <w:t xml:space="preserve"> to create new polygon list and then construct neighbors list from there?</w:t>
+      </w:r>
+    </w:p>
+    <w:p>
+      <w:pPr>
+        <w:pStyle w:val="ListParagraph"/>
+        <w:numPr>
+          <w:ilvl w:val="1"/>
+          <w:numId w:val="4"/>
+        </w:numPr>
+      </w:pPr>
+      <w:r>
+        <w:t xml:space="preserve">Migration as regressor using </w:t>
+      </w:r>
+      <w:r>
+        <w:t>NSS 64th Round</w:t>
+      </w:r>
+      <w:r>
+        <w:t xml:space="preserve">, </w:t>
+      </w:r>
+      <w:r>
+        <w:t>Employment &amp; Unemployment and Migration Survey</w:t>
+      </w:r>
+      <w:r>
+        <w:t xml:space="preserve"> data? Out-migration, place of last residence, remittances sent back</w:t>
+      </w:r>
+    </w:p>
+    <w:p>
+      <w:pPr>
+        <w:pStyle w:val="ListParagraph"/>
+        <w:numPr>
+          <w:ilvl w:val="1"/>
+          <w:numId w:val="4"/>
+        </w:numPr>
+      </w:pPr>
+      <w:r>
+        <w:t xml:space="preserve">Moran’s I calculation: </w:t>
+      </w:r>
+      <w:r>
+        <w:t>Repeat for controls which may have a strong degree of spatial autocorrelation (infrastructure, poverty, etc.)</w:t>
+      </w:r>
+    </w:p>
+    <w:p>
+      <w:pPr>
+        <w:pStyle w:val="ListParagraph"/>
+        <w:numPr>
+          <w:ilvl w:val="1"/>
+          <w:numId w:val="4"/>
+        </w:numPr>
+      </w:pPr>
+      <w:r>
         <w:lastRenderedPageBreak/>
-        <w:t xml:space="preserve">Are there any benefits to having multiple </w:t>
-      </w:r>
-      <w:proofErr w:type="gramStart"/>
-      <w:r>
-        <w:t>IV’s</w:t>
-      </w:r>
-      <w:proofErr w:type="gramEnd"/>
-      <w:r>
-        <w:t>? If so, run an overidentification test</w:t>
-      </w:r>
-    </w:p>
-    <w:p>
-      <w:pPr>
-        <w:pStyle w:val="ListParagraph"/>
-        <w:numPr>
-          <w:ilvl w:val="0"/>
-          <w:numId w:val="4"/>
-        </w:numPr>
-      </w:pPr>
-      <w:r>
-        <w:t xml:space="preserve">See if spatial spillovers </w:t>
-      </w:r>
-      <w:r>
-        <w:t xml:space="preserve">(migration, commuting students, commuting workers) </w:t>
-      </w:r>
-      <w:r>
-        <w:t>matter</w:t>
-      </w:r>
-    </w:p>
-    <w:p>
-      <w:pPr>
-        <w:pStyle w:val="ListParagraph"/>
-        <w:numPr>
-          <w:ilvl w:val="1"/>
-          <w:numId w:val="4"/>
-        </w:numPr>
-      </w:pPr>
-      <w:r>
-        <w:t>Was I able to find 2007-08 shapefiles or other solutions to fix my district matching methodology?</w:t>
-      </w:r>
-      <w:r>
-        <w:t xml:space="preserve"> Maybe merge polygons of 2020 districts which have the same district and state name in district_08</w:t>
-      </w:r>
-      <w:r>
-        <w:t xml:space="preserve"> to create new polygon list and then construct neighbors list from there?</w:t>
-      </w:r>
-    </w:p>
-    <w:p>
-      <w:pPr>
-        <w:pStyle w:val="ListParagraph"/>
-        <w:numPr>
-          <w:ilvl w:val="1"/>
-          <w:numId w:val="4"/>
-        </w:numPr>
-      </w:pPr>
-      <w:r>
-        <w:t xml:space="preserve">Migration as regressor using </w:t>
-      </w:r>
-      <w:r>
-        <w:t>NSS 64th Round</w:t>
-      </w:r>
-      <w:r>
-        <w:t xml:space="preserve">, </w:t>
-      </w:r>
-      <w:r>
-        <w:t>Employment &amp; Unemployment and Migration Survey</w:t>
-      </w:r>
-      <w:r>
-        <w:t xml:space="preserve"> data? Out-migration, place of last residence, remittances sent back</w:t>
-      </w:r>
-    </w:p>
-    <w:p>
-      <w:pPr>
-        <w:pStyle w:val="ListParagraph"/>
-        <w:numPr>
-          <w:ilvl w:val="1"/>
-          <w:numId w:val="4"/>
-        </w:numPr>
-      </w:pPr>
-      <w:r>
-        <w:t xml:space="preserve">Moran’s I calculation: </w:t>
-      </w:r>
-      <w:r>
-        <w:t>Repeat for controls which may have a strong degree of spatial autocorrelation (infrastructure, poverty, etc.)</w:t>
-      </w:r>
-    </w:p>
-    <w:p>
-      <w:pPr>
-        <w:pStyle w:val="ListParagraph"/>
-        <w:numPr>
-          <w:ilvl w:val="1"/>
-          <w:numId w:val="4"/>
-        </w:numPr>
-      </w:pPr>
-      <w:r>
         <w:t xml:space="preserve">Redo the SDM-2SLS model with </w:t>
       </w:r>
       <w:proofErr w:type="spellStart"/>
@@ -3850,6 +3790,7 @@
         </w:numPr>
       </w:pPr>
       <w:r>
+        <w:lastRenderedPageBreak/>
         <w:t>Multiple comparisons problem—how big of a deal is it? If big, how can I implement the procedure?</w:t>
       </w:r>
     </w:p>
@@ -4337,215 +4278,215 @@
         </w:numPr>
       </w:pPr>
       <w:r>
+        <w:t xml:space="preserve">APA Headings and Subheadings </w:t>
+      </w:r>
+      <w:hyperlink r:id="rId52" w:history="1">
+        <w:r>
+          <w:rPr>
+            <w:rStyle w:val="Hyperlink"/>
+          </w:rPr>
+          <w:t>guide</w:t>
+        </w:r>
+      </w:hyperlink>
+    </w:p>
+    <w:p/>
+    <w:p>
+      <w:r>
+        <w:t>Keys for data</w:t>
+      </w:r>
+    </w:p>
+    <w:p>
+      <w:pPr>
+        <w:pStyle w:val="ListParagraph"/>
+        <w:numPr>
+          <w:ilvl w:val="0"/>
+          <w:numId w:val="1"/>
+        </w:numPr>
+      </w:pPr>
+      <w:r>
+        <w:t xml:space="preserve">UDISE </w:t>
+      </w:r>
+      <w:hyperlink r:id="rId53" w:history="1">
+        <w:r>
+          <w:rPr>
+            <w:rStyle w:val="Hyperlink"/>
+          </w:rPr>
+          <w:t>metadata</w:t>
+        </w:r>
+      </w:hyperlink>
+    </w:p>
+    <w:p>
+      <w:pPr>
+        <w:pStyle w:val="ListParagraph"/>
+        <w:numPr>
+          <w:ilvl w:val="0"/>
+          <w:numId w:val="1"/>
+        </w:numPr>
+      </w:pPr>
+      <w:r>
+        <w:t xml:space="preserve">NSS </w:t>
+      </w:r>
+      <w:r>
+        <w:t xml:space="preserve">2017-18 </w:t>
+      </w:r>
+      <w:r>
+        <w:t xml:space="preserve">Household Education </w:t>
+      </w:r>
+      <w:r>
+        <w:t xml:space="preserve">Expenditure </w:t>
+      </w:r>
+      <w:hyperlink r:id="rId54" w:history="1">
+        <w:r>
+          <w:rPr>
+            <w:rStyle w:val="Hyperlink"/>
+          </w:rPr>
+          <w:t>d</w:t>
+        </w:r>
+        <w:r>
+          <w:rPr>
+            <w:rStyle w:val="Hyperlink"/>
+          </w:rPr>
+          <w:t>efinitions</w:t>
+        </w:r>
+      </w:hyperlink>
+    </w:p>
+    <w:p>
+      <w:pPr>
+        <w:pStyle w:val="ListParagraph"/>
+        <w:numPr>
+          <w:ilvl w:val="0"/>
+          <w:numId w:val="1"/>
+        </w:numPr>
+      </w:pPr>
+      <w:r>
+        <w:t>NSS 201</w:t>
+      </w:r>
+      <w:r>
+        <w:t xml:space="preserve">4-15 Social Consumption Education </w:t>
+      </w:r>
+      <w:hyperlink r:id="rId55" w:history="1">
+        <w:r>
+          <w:rPr>
+            <w:rStyle w:val="Hyperlink"/>
+          </w:rPr>
+          <w:t>data download</w:t>
+        </w:r>
+      </w:hyperlink>
+    </w:p>
+    <w:p>
+      <w:pPr>
+        <w:pStyle w:val="ListParagraph"/>
+        <w:numPr>
+          <w:ilvl w:val="1"/>
+          <w:numId w:val="1"/>
+        </w:numPr>
+      </w:pPr>
+      <w:r>
+        <w:t>v</w:t>
+      </w:r>
+      <w:r>
+        <w:t>ar34</w:t>
+      </w:r>
+      <w:r>
+        <w:t>, var8, dataeFile1, dataFile2, dataFile3, dataFile5</w:t>
+      </w:r>
+    </w:p>
+    <w:p>
+      <w:pPr>
+        <w:pStyle w:val="ListParagraph"/>
+        <w:numPr>
+          <w:ilvl w:val="0"/>
+          <w:numId w:val="1"/>
+        </w:numPr>
+      </w:pPr>
+      <w:r>
+        <w:t xml:space="preserve">NSS 2007-08 Social Consumption Education </w:t>
+      </w:r>
+      <w:hyperlink r:id="rId56" w:history="1">
+        <w:r>
+          <w:rPr>
+            <w:rStyle w:val="Hyperlink"/>
+          </w:rPr>
+          <w:t>data download</w:t>
+        </w:r>
+      </w:hyperlink>
+    </w:p>
+    <w:p>
+      <w:pPr>
+        <w:pStyle w:val="ListParagraph"/>
+        <w:numPr>
+          <w:ilvl w:val="0"/>
+          <w:numId w:val="1"/>
+        </w:numPr>
+      </w:pPr>
+      <w:r>
+        <w:t xml:space="preserve">PLFS 2020-21 Migration in India </w:t>
+      </w:r>
+      <w:hyperlink r:id="rId57" w:history="1">
+        <w:r>
+          <w:rPr>
+            <w:rStyle w:val="Hyperlink"/>
+          </w:rPr>
+          <w:t>s</w:t>
+        </w:r>
+        <w:r>
+          <w:rPr>
+            <w:rStyle w:val="Hyperlink"/>
+          </w:rPr>
+          <w:t>urvey questions</w:t>
+        </w:r>
+      </w:hyperlink>
+    </w:p>
+    <w:p>
+      <w:pPr>
+        <w:pStyle w:val="ListParagraph"/>
+        <w:numPr>
+          <w:ilvl w:val="0"/>
+          <w:numId w:val="1"/>
+        </w:numPr>
+      </w:pPr>
+      <w:r>
+        <w:t xml:space="preserve">Time Use Survey 2019 </w:t>
+      </w:r>
+      <w:hyperlink r:id="rId58" w:history="1">
+        <w:r>
+          <w:rPr>
+            <w:rStyle w:val="Hyperlink"/>
+          </w:rPr>
+          <w:t>read me</w:t>
+        </w:r>
+      </w:hyperlink>
+    </w:p>
+    <w:p>
+      <w:pPr>
+        <w:pStyle w:val="ListParagraph"/>
+        <w:numPr>
+          <w:ilvl w:val="0"/>
+          <w:numId w:val="1"/>
+        </w:numPr>
+      </w:pPr>
+      <w:r>
+        <w:t xml:space="preserve">National Achievement Survey 2017-21 </w:t>
+      </w:r>
+      <w:hyperlink r:id="rId59" w:history="1">
+        <w:r>
+          <w:rPr>
+            <w:rStyle w:val="Hyperlink"/>
+          </w:rPr>
+          <w:t>read me</w:t>
+        </w:r>
+      </w:hyperlink>
+    </w:p>
+    <w:p>
+      <w:pPr>
+        <w:pStyle w:val="ListParagraph"/>
+        <w:numPr>
+          <w:ilvl w:val="0"/>
+          <w:numId w:val="1"/>
+        </w:numPr>
+      </w:pPr>
+      <w:r>
         <w:lastRenderedPageBreak/>
-        <w:t xml:space="preserve">APA Headings and Subheadings </w:t>
-      </w:r>
-      <w:hyperlink r:id="rId52" w:history="1">
-        <w:r>
-          <w:rPr>
-            <w:rStyle w:val="Hyperlink"/>
-          </w:rPr>
-          <w:t>guide</w:t>
-        </w:r>
-      </w:hyperlink>
-    </w:p>
-    <w:p/>
-    <w:p>
-      <w:r>
-        <w:t>Keys for data</w:t>
-      </w:r>
-    </w:p>
-    <w:p>
-      <w:pPr>
-        <w:pStyle w:val="ListParagraph"/>
-        <w:numPr>
-          <w:ilvl w:val="0"/>
-          <w:numId w:val="1"/>
-        </w:numPr>
-      </w:pPr>
-      <w:r>
-        <w:t xml:space="preserve">UDISE </w:t>
-      </w:r>
-      <w:hyperlink r:id="rId53" w:history="1">
-        <w:r>
-          <w:rPr>
-            <w:rStyle w:val="Hyperlink"/>
-          </w:rPr>
-          <w:t>metadata</w:t>
-        </w:r>
-      </w:hyperlink>
-    </w:p>
-    <w:p>
-      <w:pPr>
-        <w:pStyle w:val="ListParagraph"/>
-        <w:numPr>
-          <w:ilvl w:val="0"/>
-          <w:numId w:val="1"/>
-        </w:numPr>
-      </w:pPr>
-      <w:r>
-        <w:t xml:space="preserve">NSS </w:t>
-      </w:r>
-      <w:r>
-        <w:t xml:space="preserve">2017-18 </w:t>
-      </w:r>
-      <w:r>
-        <w:t xml:space="preserve">Household Education </w:t>
-      </w:r>
-      <w:r>
-        <w:t xml:space="preserve">Expenditure </w:t>
-      </w:r>
-      <w:hyperlink r:id="rId54" w:history="1">
-        <w:r>
-          <w:rPr>
-            <w:rStyle w:val="Hyperlink"/>
-          </w:rPr>
-          <w:t>d</w:t>
-        </w:r>
-        <w:r>
-          <w:rPr>
-            <w:rStyle w:val="Hyperlink"/>
-          </w:rPr>
-          <w:t>efinitions</w:t>
-        </w:r>
-      </w:hyperlink>
-    </w:p>
-    <w:p>
-      <w:pPr>
-        <w:pStyle w:val="ListParagraph"/>
-        <w:numPr>
-          <w:ilvl w:val="0"/>
-          <w:numId w:val="1"/>
-        </w:numPr>
-      </w:pPr>
-      <w:r>
-        <w:t>NSS 201</w:t>
-      </w:r>
-      <w:r>
-        <w:t xml:space="preserve">4-15 Social Consumption Education </w:t>
-      </w:r>
-      <w:hyperlink r:id="rId55" w:history="1">
-        <w:r>
-          <w:rPr>
-            <w:rStyle w:val="Hyperlink"/>
-          </w:rPr>
-          <w:t>data download</w:t>
-        </w:r>
-      </w:hyperlink>
-    </w:p>
-    <w:p>
-      <w:pPr>
-        <w:pStyle w:val="ListParagraph"/>
-        <w:numPr>
-          <w:ilvl w:val="1"/>
-          <w:numId w:val="1"/>
-        </w:numPr>
-      </w:pPr>
-      <w:r>
-        <w:t>v</w:t>
-      </w:r>
-      <w:r>
-        <w:t>ar34</w:t>
-      </w:r>
-      <w:r>
-        <w:t>, var8, dataeFile1, dataFile2, dataFile3, dataFile5</w:t>
-      </w:r>
-    </w:p>
-    <w:p>
-      <w:pPr>
-        <w:pStyle w:val="ListParagraph"/>
-        <w:numPr>
-          <w:ilvl w:val="0"/>
-          <w:numId w:val="1"/>
-        </w:numPr>
-      </w:pPr>
-      <w:r>
-        <w:t xml:space="preserve">NSS 2007-08 Social Consumption Education </w:t>
-      </w:r>
-      <w:hyperlink r:id="rId56" w:history="1">
-        <w:r>
-          <w:rPr>
-            <w:rStyle w:val="Hyperlink"/>
-          </w:rPr>
-          <w:t>data download</w:t>
-        </w:r>
-      </w:hyperlink>
-    </w:p>
-    <w:p>
-      <w:pPr>
-        <w:pStyle w:val="ListParagraph"/>
-        <w:numPr>
-          <w:ilvl w:val="0"/>
-          <w:numId w:val="1"/>
-        </w:numPr>
-      </w:pPr>
-      <w:r>
-        <w:t xml:space="preserve">PLFS 2020-21 Migration in India </w:t>
-      </w:r>
-      <w:hyperlink r:id="rId57" w:history="1">
-        <w:r>
-          <w:rPr>
-            <w:rStyle w:val="Hyperlink"/>
-          </w:rPr>
-          <w:t>s</w:t>
-        </w:r>
-        <w:r>
-          <w:rPr>
-            <w:rStyle w:val="Hyperlink"/>
-          </w:rPr>
-          <w:t>urvey questions</w:t>
-        </w:r>
-      </w:hyperlink>
-    </w:p>
-    <w:p>
-      <w:pPr>
-        <w:pStyle w:val="ListParagraph"/>
-        <w:numPr>
-          <w:ilvl w:val="0"/>
-          <w:numId w:val="1"/>
-        </w:numPr>
-      </w:pPr>
-      <w:r>
-        <w:t xml:space="preserve">Time Use Survey 2019 </w:t>
-      </w:r>
-      <w:hyperlink r:id="rId58" w:history="1">
-        <w:r>
-          <w:rPr>
-            <w:rStyle w:val="Hyperlink"/>
-          </w:rPr>
-          <w:t>read me</w:t>
-        </w:r>
-      </w:hyperlink>
-    </w:p>
-    <w:p>
-      <w:pPr>
-        <w:pStyle w:val="ListParagraph"/>
-        <w:numPr>
-          <w:ilvl w:val="0"/>
-          <w:numId w:val="1"/>
-        </w:numPr>
-      </w:pPr>
-      <w:r>
-        <w:t xml:space="preserve">National Achievement Survey 2017-21 </w:t>
-      </w:r>
-      <w:hyperlink r:id="rId59" w:history="1">
-        <w:r>
-          <w:rPr>
-            <w:rStyle w:val="Hyperlink"/>
-          </w:rPr>
-          <w:t>read me</w:t>
-        </w:r>
-      </w:hyperlink>
-    </w:p>
-    <w:p>
-      <w:pPr>
-        <w:pStyle w:val="ListParagraph"/>
-        <w:numPr>
-          <w:ilvl w:val="0"/>
-          <w:numId w:val="1"/>
-        </w:numPr>
-      </w:pPr>
-      <w:r>
         <w:t>Annual Status of Education Report (Rural) 2022</w:t>
       </w:r>
       <w:r>
@@ -5601,7 +5542,6 @@
           <w:noProof/>
           <w14:ligatures w14:val="standardContextual"/>
         </w:rPr>
-        <w:lastRenderedPageBreak/>
         <w:t># Order columns by year</w:t>
       </w:r>
     </w:p>
@@ -5744,6 +5684,7 @@
           <w:noProof/>
           <w14:ligatures w14:val="standardContextual"/>
         </w:rPr>
+        <w:lastRenderedPageBreak/>
         <w:t>We define one fuzzy join sequence as a function which loops through fuzzy joins with parameter mode = “full” and satisfies the following: for each i in the length of the “methods” vector, the ith iteration of this loop will fuzzy join rows where the string distance metric specified by the ith element of “methods” yields a distance less than or equal to the ith element of “thresholds”. The (i+1)th iteration of the loop then takes all the rows from either df *which were unmatched in the previous iteration* and attempts to match them using the (i+1)th element of “methods” as the distance metric and the (i+1)th element of “thresholds” as the threshold. This repeats for the length of the “methods” vector. It should output three dataframes: the result of these fuzzy (full) joins, all rows from the first df it was given which remain unmatched by the end of the loop, and all rows from the second df it was given which remain unmatched by the end of the loop.</w:t>
       </w:r>
     </w:p>
@@ -5833,7 +5774,6 @@
           <w:noProof/>
           <w14:ligatures w14:val="standardContextual"/>
         </w:rPr>
-        <w:lastRenderedPageBreak/>
         <w:t xml:space="preserve">Given dataframe d, take the one column within it which begins with “district_” and does not contain the substring “code”; then take the one column within it which begins with “state_” and does not contain the substring “code”. </w:t>
       </w:r>
     </w:p>
@@ -5864,7 +5804,15 @@
           <w:noProof/>
           <w14:ligatures w14:val="standardContextual"/>
         </w:rPr>
-        <w:t>For each of these  “district_”/“state_” pairs, we will run the fuzzy join sequence on dataframe d and joined_df, matching dataframe d’s aforementioned “district_” column with this joined_df pair’s “district_” column as well as dataframe d’s aforementioned “state_” column with this joined_df pair’s “state_” column. All rows from dataframe d unmatched by the end of this sequence will go through the same process with another “district_”/“state_” pair, and so on until all “district_”/“state_” pairs which end with the last two digits of dataframe d’s name have been used.</w:t>
+        <w:t xml:space="preserve">For each of these  “district_”/“state_” pairs, we will run the fuzzy join sequence on dataframe d and joined_df, matching dataframe d’s aforementioned “district_” column with this joined_df pair’s “district_” column as well as dataframe d’s aforementioned “state_” column with this </w:t>
+      </w:r>
+      <w:r>
+        <w:rPr>
+          <w:noProof/>
+          <w14:ligatures w14:val="standardContextual"/>
+        </w:rPr>
+        <w:lastRenderedPageBreak/>
+        <w:t>joined_df pair’s “state_” column. All rows from dataframe d unmatched by the end of this sequence will go through the same process with another “district_”/“state_” pair, and so on until all “district_”/“state_” pairs which end with the last two digits of dataframe d’s name have been used.</w:t>
       </w:r>
     </w:p>
     <w:p>
@@ -5902,7 +5850,6 @@
           <w:noProof/>
           <w14:ligatures w14:val="standardContextual"/>
         </w:rPr>
-        <w:lastRenderedPageBreak/>
         <w:t>The function should then store the result of this process as joined_df. This joined_df will become the starting point for repeating all of this for the next element d in the vector of dataframe names. The final output should be joined_df.</w:t>
       </w:r>
     </w:p>
@@ -6056,6 +6003,7 @@
         </w:numPr>
       </w:pPr>
       <w:r>
+        <w:lastRenderedPageBreak/>
         <w:t xml:space="preserve">J </w:t>
       </w:r>
       <w:r>
@@ -6465,7 +6413,6 @@
         </w:numPr>
       </w:pPr>
       <w:r>
-        <w:lastRenderedPageBreak/>
         <w:t>Kanke</w:t>
       </w:r>
       <w:r>
@@ -6705,6 +6652,7 @@
         </w:numPr>
       </w:pPr>
       <w:r>
+        <w:lastRenderedPageBreak/>
         <w:t>West Distric</w:t>
       </w:r>
       <w:r>
@@ -7008,12 +6956,303 @@
         </w:numPr>
       </w:pPr>
       <w:r>
+        <w:t>South District</w:t>
+      </w:r>
+      <w:r>
+        <w:t xml:space="preserve"> to South</w:t>
+      </w:r>
+    </w:p>
+    <w:p>
+      <w:pPr>
+        <w:pStyle w:val="ListParagraph"/>
+        <w:numPr>
+          <w:ilvl w:val="0"/>
+          <w:numId w:val="5"/>
+        </w:numPr>
+      </w:pPr>
+      <w:r>
+        <w:t>East Distric</w:t>
+      </w:r>
+      <w:r>
+        <w:t>t to East</w:t>
+      </w:r>
+    </w:p>
+    <w:p>
+      <w:pPr>
+        <w:pStyle w:val="ListParagraph"/>
+        <w:numPr>
+          <w:ilvl w:val="0"/>
+          <w:numId w:val="5"/>
+        </w:numPr>
+      </w:pPr>
+      <w:r>
+        <w:t>North 24 Pargana</w:t>
+      </w:r>
+      <w:r>
+        <w:t xml:space="preserve">s to </w:t>
+      </w:r>
+      <w:r>
+        <w:t xml:space="preserve">North </w:t>
+      </w:r>
+      <w:proofErr w:type="gramStart"/>
+      <w:r>
+        <w:t>Twenty Four</w:t>
+      </w:r>
+      <w:proofErr w:type="gramEnd"/>
+      <w:r>
+        <w:t xml:space="preserve"> Pargana</w:t>
+      </w:r>
+      <w:r>
+        <w:t>s</w:t>
+      </w:r>
+    </w:p>
+    <w:p>
+      <w:pPr>
+        <w:pStyle w:val="ListParagraph"/>
+        <w:numPr>
+          <w:ilvl w:val="0"/>
+          <w:numId w:val="5"/>
+        </w:numPr>
+      </w:pPr>
+      <w:r>
+        <w:t xml:space="preserve">South </w:t>
+      </w:r>
+      <w:r>
+        <w:t>24 Pargana</w:t>
+      </w:r>
+      <w:r>
+        <w:t xml:space="preserve">s to </w:t>
+      </w:r>
+      <w:r>
+        <w:t xml:space="preserve">South </w:t>
+      </w:r>
+      <w:proofErr w:type="gramStart"/>
+      <w:r>
+        <w:t>Twenty Four</w:t>
+      </w:r>
+      <w:proofErr w:type="gramEnd"/>
+      <w:r>
+        <w:t xml:space="preserve"> Pargana</w:t>
+      </w:r>
+      <w:r>
+        <w:t>s</w:t>
+      </w:r>
+    </w:p>
+    <w:p>
+      <w:pPr>
+        <w:pStyle w:val="ListParagraph"/>
+        <w:numPr>
+          <w:ilvl w:val="0"/>
+          <w:numId w:val="5"/>
+        </w:numPr>
+      </w:pPr>
+      <w:r>
+        <w:t>W</w:t>
+      </w:r>
+      <w:r>
+        <w:t>est</w:t>
+      </w:r>
+      <w:r>
+        <w:t xml:space="preserve"> Singhbhum</w:t>
+      </w:r>
+      <w:r>
+        <w:t xml:space="preserve"> to </w:t>
+      </w:r>
+      <w:proofErr w:type="spellStart"/>
+      <w:r>
+        <w:t>Pashchimi</w:t>
+      </w:r>
+      <w:proofErr w:type="spellEnd"/>
+      <w:r>
+        <w:t xml:space="preserve"> Singhbhum</w:t>
+      </w:r>
+    </w:p>
+    <w:p>
+      <w:pPr>
+        <w:pStyle w:val="ListParagraph"/>
+        <w:numPr>
+          <w:ilvl w:val="0"/>
+          <w:numId w:val="5"/>
+        </w:numPr>
+      </w:pPr>
+      <w:r>
+        <w:t>E</w:t>
+      </w:r>
+      <w:r>
+        <w:t xml:space="preserve">ast </w:t>
+      </w:r>
+      <w:r>
+        <w:t>Singhbhum</w:t>
+      </w:r>
+      <w:r>
+        <w:t xml:space="preserve"> to </w:t>
+      </w:r>
+      <w:proofErr w:type="spellStart"/>
+      <w:r>
+        <w:t>Purbi</w:t>
+      </w:r>
+      <w:proofErr w:type="spellEnd"/>
+      <w:r>
+        <w:t xml:space="preserve"> Singhbhum</w:t>
+      </w:r>
+    </w:p>
+    <w:p>
+      <w:pPr>
+        <w:pStyle w:val="ListParagraph"/>
+        <w:numPr>
+          <w:ilvl w:val="0"/>
+          <w:numId w:val="5"/>
+        </w:numPr>
+      </w:pPr>
+      <w:r>
+        <w:t>Leh to Leh (Ladakh)</w:t>
+      </w:r>
+    </w:p>
+    <w:p>
+      <w:pPr>
+        <w:pStyle w:val="ListParagraph"/>
+        <w:numPr>
+          <w:ilvl w:val="0"/>
+          <w:numId w:val="5"/>
+        </w:numPr>
+      </w:pPr>
+      <w:r>
+        <w:t>Cooch Behar to Koch Bihar</w:t>
+      </w:r>
+    </w:p>
+    <w:p>
+      <w:pPr>
+        <w:pStyle w:val="ListParagraph"/>
+        <w:numPr>
+          <w:ilvl w:val="0"/>
+          <w:numId w:val="5"/>
+        </w:numPr>
+      </w:pPr>
+      <w:r>
+        <w:t xml:space="preserve">Dima </w:t>
+      </w:r>
+      <w:proofErr w:type="spellStart"/>
+      <w:r>
+        <w:t>Hasao</w:t>
+      </w:r>
+      <w:proofErr w:type="spellEnd"/>
+      <w:r>
+        <w:t xml:space="preserve"> to North </w:t>
+      </w:r>
+      <w:proofErr w:type="spellStart"/>
+      <w:r>
+        <w:t>Cachar</w:t>
+      </w:r>
+      <w:proofErr w:type="spellEnd"/>
+      <w:r>
+        <w:t xml:space="preserve"> Hills</w:t>
+      </w:r>
+    </w:p>
+    <w:p>
+      <w:pPr>
+        <w:pStyle w:val="ListParagraph"/>
+        <w:numPr>
+          <w:ilvl w:val="0"/>
+          <w:numId w:val="5"/>
+        </w:numPr>
+      </w:pPr>
+      <w:r>
+        <w:t>Kaimu</w:t>
+      </w:r>
+      <w:r>
+        <w:t xml:space="preserve">r to </w:t>
+      </w:r>
+      <w:r>
+        <w:t>Kaimu</w:t>
+      </w:r>
+      <w:r>
+        <w:t>r (Bhabua)</w:t>
+      </w:r>
+    </w:p>
+    <w:p>
+      <w:pPr>
+        <w:pStyle w:val="ListParagraph"/>
+        <w:numPr>
+          <w:ilvl w:val="0"/>
+          <w:numId w:val="5"/>
+        </w:numPr>
+      </w:pPr>
+      <w:proofErr w:type="spellStart"/>
+      <w:r>
+        <w:t>Kabeerdha</w:t>
+      </w:r>
+      <w:r>
+        <w:t>m</w:t>
+      </w:r>
+      <w:proofErr w:type="spellEnd"/>
+      <w:r>
+        <w:t xml:space="preserve"> to </w:t>
+      </w:r>
+      <w:proofErr w:type="spellStart"/>
+      <w:r>
+        <w:t>Kawardh</w:t>
+      </w:r>
+      <w:r>
+        <w:t>a</w:t>
+      </w:r>
+      <w:proofErr w:type="spellEnd"/>
+    </w:p>
+    <w:p>
+      <w:pPr>
+        <w:pStyle w:val="ListParagraph"/>
+        <w:numPr>
+          <w:ilvl w:val="0"/>
+          <w:numId w:val="5"/>
+        </w:numPr>
+      </w:pPr>
+      <w:r>
+        <w:t>Kutch to Kachchh</w:t>
+      </w:r>
+    </w:p>
+    <w:p>
+      <w:pPr>
+        <w:pStyle w:val="ListParagraph"/>
+        <w:numPr>
+          <w:ilvl w:val="0"/>
+          <w:numId w:val="5"/>
+        </w:numPr>
+      </w:pPr>
+      <w:r>
+        <w:t>Dang to The Dangs</w:t>
+      </w:r>
+    </w:p>
+    <w:p>
+      <w:pPr>
+        <w:pStyle w:val="ListParagraph"/>
+        <w:numPr>
+          <w:ilvl w:val="0"/>
+          <w:numId w:val="5"/>
+        </w:numPr>
+      </w:pPr>
+      <w:r>
+        <w:t>Belagavi</w:t>
+      </w:r>
+      <w:r>
+        <w:t xml:space="preserve"> to Belgaum</w:t>
+      </w:r>
+    </w:p>
+    <w:p>
+      <w:pPr>
+        <w:pStyle w:val="ListParagraph"/>
+        <w:numPr>
+          <w:ilvl w:val="0"/>
+          <w:numId w:val="5"/>
+        </w:numPr>
+      </w:pPr>
+      <w:r>
         <w:lastRenderedPageBreak/>
-        <w:t>South District</w:t>
-      </w:r>
-      <w:r>
-        <w:t xml:space="preserve"> to South</w:t>
-      </w:r>
+        <w:t xml:space="preserve">Shivamogga to </w:t>
+      </w:r>
+      <w:proofErr w:type="spellStart"/>
+      <w:r>
+        <w:t>Shimoga</w:t>
+      </w:r>
+      <w:proofErr w:type="spellEnd"/>
     </w:p>
     <w:p>
       <w:pPr>
@@ -7024,10 +7263,7 @@
         </w:numPr>
       </w:pPr>
       <w:r>
-        <w:t>East Distric</w:t>
-      </w:r>
-      <w:r>
-        <w:t>t to East</w:t>
+        <w:t>Khandwa to East Nimar</w:t>
       </w:r>
     </w:p>
     <w:p>
@@ -7039,25 +7275,113 @@
         </w:numPr>
       </w:pPr>
       <w:r>
-        <w:t>North 24 Pargana</w:t>
-      </w:r>
-      <w:r>
-        <w:t xml:space="preserve">s to </w:t>
-      </w:r>
-      <w:r>
-        <w:t xml:space="preserve">North </w:t>
-      </w:r>
+        <w:t>Khargone to West Nimar</w:t>
+      </w:r>
+    </w:p>
+    <w:p>
+      <w:pPr>
+        <w:pStyle w:val="ListParagraph"/>
+        <w:numPr>
+          <w:ilvl w:val="0"/>
+          <w:numId w:val="5"/>
+        </w:numPr>
+      </w:pPr>
+      <w:proofErr w:type="spellStart"/>
+      <w:r>
+        <w:t>Subarnapur</w:t>
+      </w:r>
+      <w:proofErr w:type="spellEnd"/>
+      <w:r>
+        <w:t xml:space="preserve"> to </w:t>
+      </w:r>
+      <w:proofErr w:type="spellStart"/>
+      <w:r>
+        <w:t>Sonapur</w:t>
+      </w:r>
+      <w:proofErr w:type="spellEnd"/>
+    </w:p>
+    <w:p>
+      <w:pPr>
+        <w:pStyle w:val="ListParagraph"/>
+        <w:numPr>
+          <w:ilvl w:val="0"/>
+          <w:numId w:val="5"/>
+        </w:numPr>
+      </w:pPr>
+      <w:proofErr w:type="spellStart"/>
+      <w:r>
+        <w:t>Amroha</w:t>
+      </w:r>
+      <w:proofErr w:type="spellEnd"/>
+      <w:r>
+        <w:t xml:space="preserve"> to </w:t>
+      </w:r>
+      <w:proofErr w:type="spellStart"/>
+      <w:r>
+        <w:t>Jyotiba</w:t>
+      </w:r>
+      <w:proofErr w:type="spellEnd"/>
+      <w:r>
+        <w:t xml:space="preserve"> Phule Nagar</w:t>
+      </w:r>
+    </w:p>
+    <w:p>
+      <w:pPr>
+        <w:pStyle w:val="ListParagraph"/>
+        <w:numPr>
+          <w:ilvl w:val="0"/>
+          <w:numId w:val="5"/>
+        </w:numPr>
+      </w:pPr>
+      <w:r>
+        <w:t>Lakhimpur Kheri to Kheri</w:t>
+      </w:r>
+    </w:p>
+    <w:p>
+      <w:pPr>
+        <w:pStyle w:val="ListParagraph"/>
+        <w:numPr>
+          <w:ilvl w:val="0"/>
+          <w:numId w:val="5"/>
+        </w:numPr>
+      </w:pPr>
+      <w:r>
+        <w:t>Central Delhi to Central</w:t>
+      </w:r>
+    </w:p>
+    <w:p>
+      <w:pPr>
+        <w:pStyle w:val="ListParagraph"/>
+        <w:numPr>
+          <w:ilvl w:val="0"/>
+          <w:numId w:val="5"/>
+        </w:numPr>
+      </w:pPr>
+      <w:r>
+        <w:t>North Delhi to North</w:t>
+      </w:r>
+    </w:p>
+    <w:p>
+      <w:pPr>
+        <w:pStyle w:val="ListParagraph"/>
+        <w:numPr>
+          <w:ilvl w:val="0"/>
+          <w:numId w:val="5"/>
+        </w:numPr>
+      </w:pPr>
       <w:proofErr w:type="gramStart"/>
       <w:r>
-        <w:t>Twenty Four</w:t>
+        <w:t>North East</w:t>
       </w:r>
       <w:proofErr w:type="gramEnd"/>
       <w:r>
-        <w:t xml:space="preserve"> Pargana</w:t>
-      </w:r>
-      <w:r>
-        <w:t>s</w:t>
-      </w:r>
+        <w:t xml:space="preserve"> Delhi to </w:t>
+      </w:r>
+      <w:proofErr w:type="gramStart"/>
+      <w:r>
+        <w:t>North East</w:t>
+      </w:r>
+      <w:proofErr w:type="gramEnd"/>
     </w:p>
     <w:p>
       <w:pPr>
@@ -7067,29 +7391,19 @@
           <w:numId w:val="5"/>
         </w:numPr>
       </w:pPr>
-      <w:r>
-        <w:t xml:space="preserve">South </w:t>
-      </w:r>
-      <w:r>
-        <w:t>24 Pargana</w:t>
-      </w:r>
-      <w:r>
-        <w:t xml:space="preserve">s to </w:t>
-      </w:r>
-      <w:r>
-        <w:t xml:space="preserve">South </w:t>
-      </w:r>
       <w:proofErr w:type="gramStart"/>
       <w:r>
-        <w:t>Twenty Four</w:t>
+        <w:t>North West</w:t>
       </w:r>
       <w:proofErr w:type="gramEnd"/>
       <w:r>
-        <w:t xml:space="preserve"> Pargana</w:t>
-      </w:r>
-      <w:r>
-        <w:t>s</w:t>
-      </w:r>
+        <w:t xml:space="preserve"> Delhi to </w:t>
+      </w:r>
+      <w:proofErr w:type="gramStart"/>
+      <w:r>
+        <w:t>North West</w:t>
+      </w:r>
+      <w:proofErr w:type="gramEnd"/>
     </w:p>
     <w:p>
       <w:pPr>
@@ -7100,24 +7414,66 @@
         </w:numPr>
       </w:pPr>
       <w:r>
-        <w:t>W</w:t>
-      </w:r>
-      <w:r>
-        <w:t>est</w:t>
-      </w:r>
-      <w:r>
-        <w:t xml:space="preserve"> Singhbhum</w:t>
-      </w:r>
-      <w:r>
-        <w:t xml:space="preserve"> to </w:t>
+        <w:t>East Delhi to East</w:t>
+      </w:r>
+    </w:p>
+    <w:p>
+      <w:pPr>
+        <w:pStyle w:val="ListParagraph"/>
+        <w:numPr>
+          <w:ilvl w:val="0"/>
+          <w:numId w:val="5"/>
+        </w:numPr>
+      </w:pPr>
+      <w:r>
+        <w:t>South Delhi to South</w:t>
+      </w:r>
+    </w:p>
+    <w:p>
+      <w:pPr>
+        <w:pStyle w:val="ListParagraph"/>
+        <w:numPr>
+          <w:ilvl w:val="0"/>
+          <w:numId w:val="5"/>
+        </w:numPr>
+      </w:pPr>
+      <w:proofErr w:type="gramStart"/>
+      <w:r>
+        <w:t>South West</w:t>
+      </w:r>
+      <w:proofErr w:type="gramEnd"/>
+      <w:r>
+        <w:t xml:space="preserve"> Delhi to </w:t>
+      </w:r>
+      <w:proofErr w:type="gramStart"/>
+      <w:r>
+        <w:t>South West</w:t>
+      </w:r>
+      <w:proofErr w:type="gramEnd"/>
+    </w:p>
+    <w:p>
+      <w:pPr>
+        <w:pStyle w:val="ListParagraph"/>
+        <w:numPr>
+          <w:ilvl w:val="0"/>
+          <w:numId w:val="5"/>
+        </w:numPr>
+      </w:pPr>
+      <w:r>
+        <w:t>West Delhi to West</w:t>
+      </w:r>
+    </w:p>
+    <w:p>
+      <w:r>
+        <w:t xml:space="preserve">In </w:t>
       </w:r>
       <w:proofErr w:type="spellStart"/>
       <w:r>
-        <w:t>Pashchimi</w:t>
+        <w:t>district_tracker</w:t>
       </w:r>
       <w:proofErr w:type="spellEnd"/>
       <w:r>
-        <w:t xml:space="preserve"> Singhbhum</w:t>
+        <w:t>:</w:t>
       </w:r>
     </w:p>
     <w:p>
@@ -7129,36 +7485,28 @@
         </w:numPr>
       </w:pPr>
       <w:r>
-        <w:t>E</w:t>
-      </w:r>
-      <w:r>
-        <w:t xml:space="preserve">ast </w:t>
-      </w:r>
-      <w:r>
-        <w:t>Singhbhum</w:t>
-      </w:r>
-      <w:r>
-        <w:t xml:space="preserve"> to </w:t>
-      </w:r>
-      <w:proofErr w:type="spellStart"/>
-      <w:r>
-        <w:t>Purbi</w:t>
-      </w:r>
-      <w:proofErr w:type="spellEnd"/>
-      <w:r>
-        <w:t xml:space="preserve"> Singhbhum</w:t>
-      </w:r>
-    </w:p>
-    <w:p>
-      <w:pPr>
-        <w:pStyle w:val="ListParagraph"/>
-        <w:numPr>
-          <w:ilvl w:val="0"/>
+        <w:t>Under the column “district_06”:</w:t>
+      </w:r>
+    </w:p>
+    <w:p>
+      <w:pPr>
+        <w:pStyle w:val="ListParagraph"/>
+        <w:numPr>
+          <w:ilvl w:val="1"/>
           <w:numId w:val="5"/>
         </w:numPr>
       </w:pPr>
       <w:r>
-        <w:t>Leh to Leh (Ladakh)</w:t>
+        <w:t>S.A.S. Naga</w:t>
+      </w:r>
+      <w:r>
+        <w:t>r to S</w:t>
+      </w:r>
+      <w:r>
+        <w:t>ahibzada Ajit Singh Naga</w:t>
+      </w:r>
+      <w:r>
+        <w:t>r</w:t>
       </w:r>
     </w:p>
     <w:p>
@@ -7170,407 +7518,6 @@
         </w:numPr>
       </w:pPr>
       <w:r>
-        <w:t>Cooch Behar to Koch Bihar</w:t>
-      </w:r>
-    </w:p>
-    <w:p>
-      <w:pPr>
-        <w:pStyle w:val="ListParagraph"/>
-        <w:numPr>
-          <w:ilvl w:val="0"/>
-          <w:numId w:val="5"/>
-        </w:numPr>
-      </w:pPr>
-      <w:r>
-        <w:t xml:space="preserve">Dima </w:t>
-      </w:r>
-      <w:proofErr w:type="spellStart"/>
-      <w:r>
-        <w:t>Hasao</w:t>
-      </w:r>
-      <w:proofErr w:type="spellEnd"/>
-      <w:r>
-        <w:t xml:space="preserve"> to North </w:t>
-      </w:r>
-      <w:proofErr w:type="spellStart"/>
-      <w:r>
-        <w:t>Cachar</w:t>
-      </w:r>
-      <w:proofErr w:type="spellEnd"/>
-      <w:r>
-        <w:t xml:space="preserve"> Hills</w:t>
-      </w:r>
-    </w:p>
-    <w:p>
-      <w:pPr>
-        <w:pStyle w:val="ListParagraph"/>
-        <w:numPr>
-          <w:ilvl w:val="0"/>
-          <w:numId w:val="5"/>
-        </w:numPr>
-      </w:pPr>
-      <w:r>
-        <w:t>Kaimu</w:t>
-      </w:r>
-      <w:r>
-        <w:t xml:space="preserve">r to </w:t>
-      </w:r>
-      <w:r>
-        <w:t>Kaimu</w:t>
-      </w:r>
-      <w:r>
-        <w:t>r (Bhabua)</w:t>
-      </w:r>
-    </w:p>
-    <w:p>
-      <w:pPr>
-        <w:pStyle w:val="ListParagraph"/>
-        <w:numPr>
-          <w:ilvl w:val="0"/>
-          <w:numId w:val="5"/>
-        </w:numPr>
-      </w:pPr>
-      <w:proofErr w:type="spellStart"/>
-      <w:r>
-        <w:t>Kabeerdha</w:t>
-      </w:r>
-      <w:r>
-        <w:t>m</w:t>
-      </w:r>
-      <w:proofErr w:type="spellEnd"/>
-      <w:r>
-        <w:t xml:space="preserve"> to </w:t>
-      </w:r>
-      <w:proofErr w:type="spellStart"/>
-      <w:r>
-        <w:t>Kawardh</w:t>
-      </w:r>
-      <w:r>
-        <w:t>a</w:t>
-      </w:r>
-      <w:proofErr w:type="spellEnd"/>
-    </w:p>
-    <w:p>
-      <w:pPr>
-        <w:pStyle w:val="ListParagraph"/>
-        <w:numPr>
-          <w:ilvl w:val="0"/>
-          <w:numId w:val="5"/>
-        </w:numPr>
-      </w:pPr>
-      <w:r>
-        <w:t>Kutch to Kachchh</w:t>
-      </w:r>
-    </w:p>
-    <w:p>
-      <w:pPr>
-        <w:pStyle w:val="ListParagraph"/>
-        <w:numPr>
-          <w:ilvl w:val="0"/>
-          <w:numId w:val="5"/>
-        </w:numPr>
-      </w:pPr>
-      <w:r>
-        <w:t>Dang to The Dangs</w:t>
-      </w:r>
-    </w:p>
-    <w:p>
-      <w:pPr>
-        <w:pStyle w:val="ListParagraph"/>
-        <w:numPr>
-          <w:ilvl w:val="0"/>
-          <w:numId w:val="5"/>
-        </w:numPr>
-      </w:pPr>
-      <w:r>
-        <w:t>Belagavi</w:t>
-      </w:r>
-      <w:r>
-        <w:t xml:space="preserve"> to Belgaum</w:t>
-      </w:r>
-    </w:p>
-    <w:p>
-      <w:pPr>
-        <w:pStyle w:val="ListParagraph"/>
-        <w:numPr>
-          <w:ilvl w:val="0"/>
-          <w:numId w:val="5"/>
-        </w:numPr>
-      </w:pPr>
-      <w:r>
-        <w:t xml:space="preserve">Shivamogga to </w:t>
-      </w:r>
-      <w:proofErr w:type="spellStart"/>
-      <w:r>
-        <w:t>Shimoga</w:t>
-      </w:r>
-      <w:proofErr w:type="spellEnd"/>
-    </w:p>
-    <w:p>
-      <w:pPr>
-        <w:pStyle w:val="ListParagraph"/>
-        <w:numPr>
-          <w:ilvl w:val="0"/>
-          <w:numId w:val="5"/>
-        </w:numPr>
-      </w:pPr>
-      <w:r>
-        <w:t>Khandwa to East Nimar</w:t>
-      </w:r>
-    </w:p>
-    <w:p>
-      <w:pPr>
-        <w:pStyle w:val="ListParagraph"/>
-        <w:numPr>
-          <w:ilvl w:val="0"/>
-          <w:numId w:val="5"/>
-        </w:numPr>
-      </w:pPr>
-      <w:r>
-        <w:t>Khargone to West Nimar</w:t>
-      </w:r>
-    </w:p>
-    <w:p>
-      <w:pPr>
-        <w:pStyle w:val="ListParagraph"/>
-        <w:numPr>
-          <w:ilvl w:val="0"/>
-          <w:numId w:val="5"/>
-        </w:numPr>
-      </w:pPr>
-      <w:proofErr w:type="spellStart"/>
-      <w:r>
-        <w:t>Subarnapur</w:t>
-      </w:r>
-      <w:proofErr w:type="spellEnd"/>
-      <w:r>
-        <w:t xml:space="preserve"> to </w:t>
-      </w:r>
-      <w:proofErr w:type="spellStart"/>
-      <w:r>
-        <w:t>Sonapur</w:t>
-      </w:r>
-      <w:proofErr w:type="spellEnd"/>
-    </w:p>
-    <w:p>
-      <w:pPr>
-        <w:pStyle w:val="ListParagraph"/>
-        <w:numPr>
-          <w:ilvl w:val="0"/>
-          <w:numId w:val="5"/>
-        </w:numPr>
-      </w:pPr>
-      <w:proofErr w:type="spellStart"/>
-      <w:r>
-        <w:t>Amroha</w:t>
-      </w:r>
-      <w:proofErr w:type="spellEnd"/>
-      <w:r>
-        <w:t xml:space="preserve"> to </w:t>
-      </w:r>
-      <w:proofErr w:type="spellStart"/>
-      <w:r>
-        <w:t>Jyotiba</w:t>
-      </w:r>
-      <w:proofErr w:type="spellEnd"/>
-      <w:r>
-        <w:t xml:space="preserve"> Phule Nagar</w:t>
-      </w:r>
-    </w:p>
-    <w:p>
-      <w:pPr>
-        <w:pStyle w:val="ListParagraph"/>
-        <w:numPr>
-          <w:ilvl w:val="0"/>
-          <w:numId w:val="5"/>
-        </w:numPr>
-      </w:pPr>
-      <w:r>
-        <w:t>Lakhimpur Kheri to Kheri</w:t>
-      </w:r>
-    </w:p>
-    <w:p>
-      <w:pPr>
-        <w:pStyle w:val="ListParagraph"/>
-        <w:numPr>
-          <w:ilvl w:val="0"/>
-          <w:numId w:val="5"/>
-        </w:numPr>
-      </w:pPr>
-      <w:r>
-        <w:t>Central Delhi to Central</w:t>
-      </w:r>
-    </w:p>
-    <w:p>
-      <w:pPr>
-        <w:pStyle w:val="ListParagraph"/>
-        <w:numPr>
-          <w:ilvl w:val="0"/>
-          <w:numId w:val="5"/>
-        </w:numPr>
-      </w:pPr>
-      <w:r>
-        <w:t>North Delhi to North</w:t>
-      </w:r>
-    </w:p>
-    <w:p>
-      <w:pPr>
-        <w:pStyle w:val="ListParagraph"/>
-        <w:numPr>
-          <w:ilvl w:val="0"/>
-          <w:numId w:val="5"/>
-        </w:numPr>
-      </w:pPr>
-      <w:proofErr w:type="gramStart"/>
-      <w:r>
-        <w:t>North East</w:t>
-      </w:r>
-      <w:proofErr w:type="gramEnd"/>
-      <w:r>
-        <w:t xml:space="preserve"> Delhi to </w:t>
-      </w:r>
-      <w:proofErr w:type="gramStart"/>
-      <w:r>
-        <w:t>North East</w:t>
-      </w:r>
-      <w:proofErr w:type="gramEnd"/>
-    </w:p>
-    <w:p>
-      <w:pPr>
-        <w:pStyle w:val="ListParagraph"/>
-        <w:numPr>
-          <w:ilvl w:val="0"/>
-          <w:numId w:val="5"/>
-        </w:numPr>
-      </w:pPr>
-      <w:proofErr w:type="gramStart"/>
-      <w:r>
-        <w:t>North West</w:t>
-      </w:r>
-      <w:proofErr w:type="gramEnd"/>
-      <w:r>
-        <w:t xml:space="preserve"> Delhi to </w:t>
-      </w:r>
-      <w:proofErr w:type="gramStart"/>
-      <w:r>
-        <w:t>North West</w:t>
-      </w:r>
-      <w:proofErr w:type="gramEnd"/>
-    </w:p>
-    <w:p>
-      <w:pPr>
-        <w:pStyle w:val="ListParagraph"/>
-        <w:numPr>
-          <w:ilvl w:val="0"/>
-          <w:numId w:val="5"/>
-        </w:numPr>
-      </w:pPr>
-      <w:r>
-        <w:t>East Delhi to East</w:t>
-      </w:r>
-    </w:p>
-    <w:p>
-      <w:pPr>
-        <w:pStyle w:val="ListParagraph"/>
-        <w:numPr>
-          <w:ilvl w:val="0"/>
-          <w:numId w:val="5"/>
-        </w:numPr>
-      </w:pPr>
-      <w:r>
-        <w:t>South Delhi to South</w:t>
-      </w:r>
-    </w:p>
-    <w:p>
-      <w:pPr>
-        <w:pStyle w:val="ListParagraph"/>
-        <w:numPr>
-          <w:ilvl w:val="0"/>
-          <w:numId w:val="5"/>
-        </w:numPr>
-      </w:pPr>
-      <w:proofErr w:type="gramStart"/>
-      <w:r>
-        <w:t>South West</w:t>
-      </w:r>
-      <w:proofErr w:type="gramEnd"/>
-      <w:r>
-        <w:t xml:space="preserve"> Delhi to </w:t>
-      </w:r>
-      <w:proofErr w:type="gramStart"/>
-      <w:r>
-        <w:t>South West</w:t>
-      </w:r>
-      <w:proofErr w:type="gramEnd"/>
-    </w:p>
-    <w:p>
-      <w:pPr>
-        <w:pStyle w:val="ListParagraph"/>
-        <w:numPr>
-          <w:ilvl w:val="0"/>
-          <w:numId w:val="5"/>
-        </w:numPr>
-      </w:pPr>
-      <w:r>
-        <w:t>West Delhi to West</w:t>
-      </w:r>
-    </w:p>
-    <w:p>
-      <w:r>
-        <w:t xml:space="preserve">In </w:t>
-      </w:r>
-      <w:proofErr w:type="spellStart"/>
-      <w:r>
-        <w:t>district_tracker</w:t>
-      </w:r>
-      <w:proofErr w:type="spellEnd"/>
-      <w:r>
-        <w:t>:</w:t>
-      </w:r>
-    </w:p>
-    <w:p>
-      <w:pPr>
-        <w:pStyle w:val="ListParagraph"/>
-        <w:numPr>
-          <w:ilvl w:val="0"/>
-          <w:numId w:val="5"/>
-        </w:numPr>
-      </w:pPr>
-      <w:r>
-        <w:t>Under the column “district_06”:</w:t>
-      </w:r>
-    </w:p>
-    <w:p>
-      <w:pPr>
-        <w:pStyle w:val="ListParagraph"/>
-        <w:numPr>
-          <w:ilvl w:val="1"/>
-          <w:numId w:val="5"/>
-        </w:numPr>
-      </w:pPr>
-      <w:r>
-        <w:t>S.A.S. Naga</w:t>
-      </w:r>
-      <w:r>
-        <w:t>r to S</w:t>
-      </w:r>
-      <w:r>
-        <w:t>ahibzada Ajit Singh Naga</w:t>
-      </w:r>
-      <w:r>
-        <w:t>r</w:t>
-      </w:r>
-    </w:p>
-    <w:p>
-      <w:pPr>
-        <w:pStyle w:val="ListParagraph"/>
-        <w:numPr>
-          <w:ilvl w:val="0"/>
-          <w:numId w:val="5"/>
-        </w:numPr>
-      </w:pPr>
-      <w:r>
-        <w:lastRenderedPageBreak/>
         <w:t>Under “district_08”:</w:t>
       </w:r>
     </w:p>

</xml_diff>

<commit_message>
docs(plan): update to-do list; remove duplicated or completed items"
</commit_message>
<xml_diff>
--- a/docs/plan/TO-DO Research Paper ECON 623.docx
+++ b/docs/plan/TO-DO Research Paper ECON 623.docx
@@ -2938,24 +2938,10 @@
         <w:t>these new response variables</w:t>
       </w:r>
     </w:p>
-    <w:p>
-      <w:pPr>
-        <w:pStyle w:val="ListParagraph"/>
-        <w:numPr>
-          <w:ilvl w:val="0"/>
-          <w:numId w:val="4"/>
-        </w:numPr>
-      </w:pPr>
-      <w:r>
-        <w:t xml:space="preserve">Update </w:t>
-      </w:r>
-      <w:r>
-        <w:t>presentation slides with updated results</w:t>
-      </w:r>
-    </w:p>
     <w:p/>
     <w:p>
       <w:r>
+        <w:lastRenderedPageBreak/>
         <w:t>Least important changes</w:t>
       </w:r>
     </w:p>
@@ -3181,6 +3167,7 @@
     </w:p>
     <w:p>
       <w:r>
+        <w:lastRenderedPageBreak/>
         <w:t xml:space="preserve">Nested models from </w:t>
       </w:r>
       <w:hyperlink r:id="rId27" w:anchor="Nested_models" w:history="1">
@@ -3551,7 +3538,6 @@
         </w:numPr>
       </w:pPr>
       <w:r>
-        <w:lastRenderedPageBreak/>
         <w:t xml:space="preserve">APA Headings and Subheadings </w:t>
       </w:r>
       <w:hyperlink r:id="rId46" w:history="1">
@@ -4044,6 +4030,7 @@
     <w:p>
       <w:proofErr w:type="spellStart"/>
       <w:r>
+        <w:lastRenderedPageBreak/>
         <w:t>knitr</w:t>
       </w:r>
       <w:proofErr w:type="spellEnd"/>

</xml_diff>